<commit_message>
TS 5.7 Kramam Tamil and Sanskrit
</commit_message>
<xml_diff>
--- a/TS-Kramam/TS-5.7/TS 5.7 Tamil Krama Paatam Corrections.docx
+++ b/TS-Kramam/TS-5.7/TS 5.7 Tamil Krama Paatam Corrections.docx
@@ -140,12 +140,16 @@
               <w:spacing w:before="0" w:line="240" w:lineRule="auto"/>
               <w:jc w:val="center"/>
               <w:rPr>
+                <w:b/>
+                <w:bCs/>
                 <w:sz w:val="32"/>
                 <w:szCs w:val="32"/>
               </w:rPr>
             </w:pPr>
             <w:r>
               <w:rPr>
+                <w:b/>
+                <w:bCs/>
                 <w:sz w:val="32"/>
                 <w:szCs w:val="32"/>
               </w:rPr>
@@ -157,12 +161,16 @@
               <w:spacing w:before="0" w:line="240" w:lineRule="auto"/>
               <w:jc w:val="center"/>
               <w:rPr>
+                <w:b/>
+                <w:bCs/>
                 <w:sz w:val="32"/>
                 <w:szCs w:val="32"/>
               </w:rPr>
             </w:pPr>
             <w:r>
               <w:rPr>
+                <w:b/>
+                <w:bCs/>
                 <w:sz w:val="32"/>
                 <w:szCs w:val="32"/>
               </w:rPr>
@@ -179,12 +187,16 @@
               <w:spacing w:before="0" w:line="240" w:lineRule="auto"/>
               <w:jc w:val="center"/>
               <w:rPr>
+                <w:b/>
+                <w:bCs/>
                 <w:sz w:val="32"/>
                 <w:szCs w:val="32"/>
               </w:rPr>
             </w:pPr>
             <w:r>
               <w:rPr>
+                <w:b/>
+                <w:bCs/>
                 <w:sz w:val="32"/>
                 <w:szCs w:val="32"/>
               </w:rPr>
@@ -202,12 +214,16 @@
               <w:ind w:right="-18"/>
               <w:jc w:val="center"/>
               <w:rPr>
+                <w:b/>
+                <w:bCs/>
                 <w:sz w:val="32"/>
                 <w:szCs w:val="32"/>
               </w:rPr>
             </w:pPr>
             <w:r>
               <w:rPr>
+                <w:b/>
+                <w:bCs/>
                 <w:sz w:val="32"/>
                 <w:szCs w:val="32"/>
               </w:rPr>
@@ -255,25 +271,25 @@
                 <w:sz w:val="28"/>
                 <w:szCs w:val="32"/>
               </w:rPr>
-              <w:t>T.S.5.7.</w:t>
-            </w:r>
-            <w:r>
-              <w:rPr>
-                <w:rFonts w:cs="Arial"/>
-                <w:b/>
-                <w:sz w:val="28"/>
-                <w:szCs w:val="32"/>
-              </w:rPr>
-              <w:t>6.3</w:t>
-            </w:r>
-            <w:r>
-              <w:rPr>
-                <w:rFonts w:cs="Arial"/>
-                <w:b/>
-                <w:sz w:val="28"/>
-                <w:szCs w:val="32"/>
-              </w:rPr>
-              <w:t xml:space="preserve"> – Kramam</w:t>
+              <w:t>T.S.5.</w:t>
+            </w:r>
+            <w:r>
+              <w:rPr>
+                <w:rFonts w:cs="Arial"/>
+                <w:b/>
+                <w:sz w:val="28"/>
+                <w:szCs w:val="32"/>
+              </w:rPr>
+              <w:t>7.5.5</w:t>
+            </w:r>
+            <w:r>
+              <w:rPr>
+                <w:rFonts w:cs="Arial"/>
+                <w:b/>
+                <w:sz w:val="28"/>
+                <w:szCs w:val="32"/>
+              </w:rPr>
+              <w:t>– Kramam</w:t>
             </w:r>
           </w:p>
           <w:p>
@@ -303,7 +319,7 @@
                 <w:szCs w:val="32"/>
                 <w:lang w:val="en-IN"/>
               </w:rPr>
-              <w:t>Krama Vaakyam No.– 53</w:t>
+              <w:t>Krama Vaakyam No.– 49</w:t>
             </w:r>
           </w:p>
           <w:p>
@@ -322,27 +338,36 @@
                 <w:b/>
                 <w:sz w:val="28"/>
                 <w:szCs w:val="32"/>
+              </w:rPr>
+            </w:pPr>
+            <w:r>
+              <w:rPr>
+                <w:rFonts w:cs="Arial"/>
+                <w:b/>
+                <w:sz w:val="28"/>
+                <w:szCs w:val="32"/>
                 <w:lang w:val="it-IT"/>
               </w:rPr>
-            </w:pPr>
-            <w:r>
-              <w:rPr>
-                <w:rFonts w:cs="Arial"/>
-                <w:b/>
-                <w:sz w:val="28"/>
+              <w:t>Panchaati No</w:t>
+            </w:r>
+            <w:r>
+              <w:rPr>
+                <w:rFonts w:cs="Arial"/>
+                <w:b/>
                 <w:szCs w:val="32"/>
                 <w:lang w:val="it-IT"/>
               </w:rPr>
-              <w:t>Panchaati No</w:t>
-            </w:r>
-            <w:r>
-              <w:rPr>
-                <w:rFonts w:cs="Arial"/>
-                <w:b/>
+              <w:t xml:space="preserve">. - </w:t>
+            </w:r>
+            <w:r>
+              <w:rPr>
+                <w:rFonts w:cs="Arial"/>
+                <w:b/>
+                <w:sz w:val="28"/>
                 <w:szCs w:val="32"/>
                 <w:lang w:val="it-IT"/>
               </w:rPr>
-              <w:t xml:space="preserve">. - </w:t>
+              <w:t>2</w:t>
             </w:r>
             <w:r>
               <w:rPr>
@@ -352,17 +377,7 @@
                 <w:szCs w:val="32"/>
                 <w:lang w:val="it-IT"/>
               </w:rPr>
-              <w:t>2</w:t>
-            </w:r>
-            <w:r>
-              <w:rPr>
-                <w:rFonts w:cs="Arial"/>
-                <w:b/>
-                <w:sz w:val="28"/>
-                <w:szCs w:val="32"/>
-                <w:lang w:val="it-IT"/>
-              </w:rPr>
-              <w:t>6</w:t>
+              <w:t>1</w:t>
             </w:r>
           </w:p>
         </w:tc>
@@ -384,11 +399,11 @@
               <w:adjustRightInd w:val="0"/>
               <w:spacing w:before="0" w:line="240" w:lineRule="auto"/>
               <w:rPr>
-                <w:rFonts w:ascii="BRH Malayalam Extra" w:eastAsia="Times New Roman" w:hAnsi="BRH Malayalam Extra" w:cs="BRH Malayalam Extra"/>
-                <w:color w:val="000000"/>
-                <w:sz w:val="40"/>
-                <w:szCs w:val="40"/>
-                <w:lang w:val="it-IT" w:eastAsia="en-IN" w:bidi="ml-IN"/>
+                <w:rFonts w:ascii="Latha" w:hAnsi="Latha" w:cs="Latha"/>
+                <w:sz w:val="28"/>
+                <w:szCs w:val="28"/>
+                <w:cs/>
+                <w:lang w:bidi="ta-IN"/>
               </w:rPr>
             </w:pPr>
             <w:r>
@@ -399,7 +414,47 @@
                 <w:cs/>
                 <w:lang w:bidi="ta-IN"/>
               </w:rPr>
-              <w:t>ப்</w:t>
+              <w:t>ப்ர</w:t>
+            </w:r>
+            <w:r>
+              <w:rPr>
+                <w:rFonts w:ascii="BRH Tamil Tab Extra" w:hAnsi="BRH Tamil Tab Extra" w:cs="Latha"/>
+                <w:b/>
+                <w:sz w:val="32"/>
+                <w:szCs w:val="28"/>
+                <w:lang w:bidi="ta-IN"/>
+              </w:rPr>
+              <w:t>……</w:t>
+            </w:r>
+            <w:r>
+              <w:rPr>
+                <w:rFonts w:ascii="Latha" w:hAnsi="Latha" w:cs="Latha"/>
+                <w:sz w:val="28"/>
+                <w:szCs w:val="28"/>
+                <w:cs/>
+                <w:lang w:bidi="ta-IN"/>
+              </w:rPr>
+              <w:t>ஜாப</w:t>
+            </w:r>
+            <w:r>
+              <w:rPr>
+                <w:rFonts w:ascii="BRH Tamil Tab Extra" w:hAnsi="BRH Tamil Tab Extra" w:cs="Latha"/>
+                <w:b/>
+                <w:sz w:val="36"/>
+                <w:szCs w:val="28"/>
+                <w:lang w:bidi="ta-IN"/>
+              </w:rPr>
+              <w:t>†</w:t>
+            </w:r>
+            <w:r>
+              <w:rPr>
+                <w:rFonts w:ascii="Latha" w:hAnsi="Latha" w:cs="Latha"/>
+                <w:sz w:val="28"/>
+                <w:szCs w:val="28"/>
+                <w:cs/>
+                <w:lang w:bidi="ta-IN"/>
+              </w:rPr>
+              <w:t>திமப்</w:t>
             </w:r>
             <w:r>
               <w:rPr>
@@ -417,66 +472,12 @@
             <w:r>
               <w:rPr>
                 <w:rFonts w:ascii="Latha" w:hAnsi="Latha" w:cs="Latha"/>
-                <w:b/>
-                <w:bCs/>
-                <w:i/>
-                <w:iCs/>
-                <w:sz w:val="28"/>
-                <w:szCs w:val="28"/>
-                <w:cs/>
-                <w:lang w:bidi="ta-IN"/>
-              </w:rPr>
-              <w:t>ரு</w:t>
-            </w:r>
-            <w:r>
-              <w:rPr>
-                <w:rFonts w:ascii="BRH Tamil Tab Extra" w:hAnsi="BRH Tamil Tab Extra" w:cs="Latha"/>
-                <w:b/>
-                <w:sz w:val="32"/>
-                <w:szCs w:val="28"/>
-                <w:lang w:val="it-IT" w:bidi="ta-IN"/>
-              </w:rPr>
-              <w:t>……</w:t>
-            </w:r>
-            <w:r>
-              <w:rPr>
-                <w:rFonts w:ascii="Latha" w:hAnsi="Latha" w:cs="Latha"/>
-                <w:sz w:val="28"/>
-                <w:szCs w:val="28"/>
-                <w:cs/>
-                <w:lang w:bidi="ta-IN"/>
-              </w:rPr>
-              <w:t>ஹ</w:t>
-            </w:r>
-            <w:r>
-              <w:rPr>
-                <w:rFonts w:ascii="BRH Tamil Tab Extra" w:hAnsi="BRH Tamil Tab Extra" w:cs="Latha"/>
-                <w:b/>
-                <w:sz w:val="32"/>
-                <w:szCs w:val="28"/>
-                <w:lang w:val="it-IT" w:bidi="ta-IN"/>
-              </w:rPr>
-              <w:t>……</w:t>
-            </w:r>
-            <w:r>
-              <w:rPr>
-                <w:rFonts w:ascii="Latha" w:hAnsi="Latha" w:cs="Latha"/>
-                <w:sz w:val="28"/>
-                <w:szCs w:val="28"/>
-                <w:cs/>
-                <w:lang w:bidi="ta-IN"/>
-              </w:rPr>
-              <w:t>ஸ்ப</w:t>
-            </w:r>
-            <w:r>
-              <w:rPr>
-                <w:rFonts w:ascii="BRH Tamil Tab Extra" w:hAnsi="BRH Tamil Tab Extra" w:cs="Latha"/>
-                <w:b/>
-                <w:sz w:val="32"/>
-                <w:szCs w:val="28"/>
-                <w:lang w:val="it-IT" w:bidi="ta-IN"/>
-              </w:rPr>
-              <w:t>……</w:t>
+                <w:sz w:val="28"/>
+                <w:szCs w:val="28"/>
+                <w:cs/>
+                <w:lang w:bidi="ta-IN"/>
+              </w:rPr>
+              <w:t>ர</w:t>
             </w:r>
             <w:r>
               <w:rPr>
@@ -487,111 +488,26 @@
                 <w:cs/>
                 <w:lang w:bidi="ta-IN"/>
               </w:rPr>
-              <w:t>தே</w:t>
-            </w:r>
-            <w:r>
-              <w:rPr>
-                <w:rFonts w:ascii="BRH Tamil Tab Extra" w:hAnsi="BRH Tamil Tab Extra" w:cs="Latha"/>
-                <w:b/>
-                <w:sz w:val="32"/>
-                <w:szCs w:val="28"/>
-                <w:lang w:val="it-IT" w:bidi="ta-IN"/>
-              </w:rPr>
-              <w:t>……</w:t>
-            </w:r>
-            <w:r>
-              <w:rPr>
-                <w:rFonts w:ascii="Latha" w:hAnsi="Latha" w:cs="Latha"/>
-                <w:sz w:val="28"/>
-                <w:szCs w:val="28"/>
-                <w:lang w:val="it-IT" w:bidi="ta-IN"/>
-              </w:rPr>
-              <w:t xml:space="preserve"> </w:t>
-            </w:r>
-            <w:r>
-              <w:rPr>
-                <w:rFonts w:ascii="Latha" w:hAnsi="Latha" w:cs="Latha"/>
-                <w:sz w:val="28"/>
-                <w:szCs w:val="28"/>
-                <w:cs/>
-                <w:lang w:bidi="ta-IN"/>
-              </w:rPr>
-              <w:t>இதி</w:t>
-            </w:r>
-            <w:r>
-              <w:rPr>
-                <w:rFonts w:ascii="BRH Tamil Tab Extra" w:hAnsi="BRH Tamil Tab Extra" w:cs="Latha"/>
-                <w:b/>
-                <w:sz w:val="36"/>
-                <w:szCs w:val="28"/>
-                <w:lang w:val="it-IT" w:bidi="ta-IN"/>
-              </w:rPr>
-              <w:t>†</w:t>
-            </w:r>
-            <w:r>
-              <w:rPr>
-                <w:rFonts w:ascii="Latha" w:hAnsi="Latha" w:cs="Latha"/>
-                <w:sz w:val="28"/>
-                <w:szCs w:val="28"/>
-                <w:lang w:val="it-IT" w:bidi="ta-IN"/>
-              </w:rPr>
-              <w:t xml:space="preserve"> </w:t>
-            </w:r>
-            <w:r>
-              <w:rPr>
-                <w:rFonts w:ascii="Latha" w:hAnsi="Latha" w:cs="Latha"/>
-                <w:sz w:val="28"/>
-                <w:szCs w:val="28"/>
-                <w:cs/>
-                <w:lang w:bidi="ta-IN"/>
-              </w:rPr>
-              <w:t>ப்</w:t>
-            </w:r>
-            <w:r>
-              <w:rPr>
-                <w:rFonts w:ascii="Latha" w:hAnsi="Latha" w:cs="Latha"/>
-                <w:b/>
-                <w:bCs/>
-                <w:position w:val="-12"/>
-                <w:sz w:val="28"/>
-                <w:szCs w:val="28"/>
-                <w:cs/>
-                <w:lang w:bidi="ta-IN"/>
-              </w:rPr>
-              <w:t>3</w:t>
-            </w:r>
-            <w:r>
-              <w:rPr>
-                <w:rFonts w:ascii="Latha" w:hAnsi="Latha" w:cs="Latha"/>
-                <w:b/>
-                <w:bCs/>
-                <w:i/>
-                <w:iCs/>
-                <w:sz w:val="28"/>
-                <w:szCs w:val="28"/>
-                <w:cs/>
-                <w:lang w:bidi="ta-IN"/>
-              </w:rPr>
-              <w:t>ரு</w:t>
-            </w:r>
-            <w:r>
-              <w:rPr>
-                <w:rFonts w:ascii="Latha" w:hAnsi="Latha" w:cs="Latha"/>
-                <w:sz w:val="28"/>
-                <w:szCs w:val="28"/>
-                <w:cs/>
-                <w:lang w:bidi="ta-IN"/>
-              </w:rPr>
-              <w:t>ஹஸ்பதே</w:t>
-            </w:r>
-            <w:r>
-              <w:rPr>
-                <w:rFonts w:ascii="Latha" w:hAnsi="Latha" w:cs="Latha"/>
-                <w:sz w:val="28"/>
-                <w:szCs w:val="28"/>
-                <w:lang w:val="it-IT" w:bidi="ta-IN"/>
-              </w:rPr>
-              <w:t xml:space="preserve"> ||</w:t>
+              <w:t>வி</w:t>
+            </w:r>
+            <w:r>
+              <w:rPr>
+                <w:rFonts w:ascii="Latha" w:hAnsi="Latha" w:cs="Latha"/>
+                <w:sz w:val="28"/>
+                <w:szCs w:val="28"/>
+                <w:cs/>
+                <w:lang w:bidi="ta-IN"/>
+              </w:rPr>
+              <w:t>த்</w:t>
+            </w:r>
+            <w:r>
+              <w:rPr>
+                <w:rFonts w:ascii="Latha" w:hAnsi="Latha" w:cs="Latha"/>
+                <w:sz w:val="28"/>
+                <w:szCs w:val="28"/>
+                <w:lang w:bidi="ta-IN"/>
+              </w:rPr>
+              <w:t xml:space="preserve"> |</w:t>
             </w:r>
           </w:p>
         </w:tc>
@@ -610,506 +526,11 @@
               <w:spacing w:before="0" w:line="240" w:lineRule="auto"/>
               <w:ind w:right="-106"/>
               <w:rPr>
-                <w:rFonts w:ascii="BRH Malayalam Extra" w:eastAsia="Times New Roman" w:hAnsi="BRH Malayalam Extra" w:cs="BRH Malayalam Extra"/>
-                <w:color w:val="000000"/>
-                <w:sz w:val="40"/>
-                <w:szCs w:val="40"/>
-                <w:lang w:val="it-IT" w:eastAsia="en-IN" w:bidi="ml-IN"/>
-              </w:rPr>
-            </w:pPr>
-            <w:r>
-              <w:rPr>
-                <w:rFonts w:ascii="Latha" w:hAnsi="Latha" w:cs="Latha"/>
-                <w:sz w:val="28"/>
-                <w:szCs w:val="28"/>
-                <w:cs/>
-                <w:lang w:bidi="ta-IN"/>
-              </w:rPr>
-              <w:t>ப்</w:t>
-            </w:r>
-            <w:r>
-              <w:rPr>
-                <w:rFonts w:ascii="Latha" w:hAnsi="Latha" w:cs="Latha"/>
-                <w:b/>
-                <w:bCs/>
-                <w:position w:val="-12"/>
-                <w:sz w:val="28"/>
-                <w:szCs w:val="28"/>
-                <w:cs/>
-                <w:lang w:bidi="ta-IN"/>
-              </w:rPr>
-              <w:t>3</w:t>
-            </w:r>
-            <w:r>
-              <w:rPr>
-                <w:rFonts w:ascii="Latha" w:hAnsi="Latha" w:cs="Latha"/>
-                <w:b/>
-                <w:bCs/>
-                <w:i/>
-                <w:iCs/>
-                <w:sz w:val="28"/>
-                <w:szCs w:val="28"/>
-                <w:cs/>
-                <w:lang w:bidi="ta-IN"/>
-              </w:rPr>
-              <w:t>ரு</w:t>
-            </w:r>
-            <w:r>
-              <w:rPr>
-                <w:rFonts w:ascii="BRH Tamil Tab Extra" w:hAnsi="BRH Tamil Tab Extra" w:cs="Latha"/>
-                <w:b/>
-                <w:sz w:val="32"/>
-                <w:szCs w:val="28"/>
-                <w:lang w:val="it-IT" w:bidi="ta-IN"/>
-              </w:rPr>
-              <w:t>……</w:t>
-            </w:r>
-            <w:r>
-              <w:rPr>
-                <w:rFonts w:ascii="Latha" w:hAnsi="Latha" w:cs="Latha"/>
-                <w:sz w:val="28"/>
-                <w:szCs w:val="28"/>
-                <w:cs/>
-                <w:lang w:bidi="ta-IN"/>
-              </w:rPr>
-              <w:t>ஹ</w:t>
-            </w:r>
-            <w:r>
-              <w:rPr>
-                <w:rFonts w:ascii="BRH Tamil Tab Extra" w:hAnsi="BRH Tamil Tab Extra" w:cs="Latha"/>
-                <w:b/>
-                <w:sz w:val="32"/>
-                <w:szCs w:val="28"/>
-                <w:lang w:val="it-IT" w:bidi="ta-IN"/>
-              </w:rPr>
-              <w:t>……</w:t>
-            </w:r>
-            <w:r>
-              <w:rPr>
-                <w:rFonts w:ascii="Latha" w:hAnsi="Latha" w:cs="Latha"/>
-                <w:sz w:val="28"/>
-                <w:szCs w:val="28"/>
-                <w:cs/>
-                <w:lang w:bidi="ta-IN"/>
-              </w:rPr>
-              <w:t>ஸ்ப</w:t>
-            </w:r>
-            <w:r>
-              <w:rPr>
-                <w:rFonts w:ascii="BRH Tamil Tab Extra" w:hAnsi="BRH Tamil Tab Extra" w:cs="Latha"/>
-                <w:b/>
-                <w:sz w:val="32"/>
-                <w:szCs w:val="28"/>
-                <w:lang w:val="it-IT" w:bidi="ta-IN"/>
-              </w:rPr>
-              <w:t>……</w:t>
-            </w:r>
-            <w:r>
-              <w:rPr>
-                <w:rFonts w:ascii="Latha" w:hAnsi="Latha" w:cs="Latha"/>
-                <w:sz w:val="28"/>
-                <w:szCs w:val="28"/>
-                <w:highlight w:val="green"/>
-                <w:cs/>
-                <w:lang w:bidi="ta-IN"/>
-              </w:rPr>
-              <w:t>த</w:t>
-            </w:r>
-            <w:r>
-              <w:rPr>
-                <w:rFonts w:ascii="BRH Tamil Tab Extra" w:hAnsi="BRH Tamil Tab Extra" w:cs="Latha"/>
-                <w:b/>
-                <w:sz w:val="32"/>
-                <w:szCs w:val="28"/>
-                <w:lang w:val="it-IT" w:bidi="ta-IN"/>
-              </w:rPr>
-              <w:t>……</w:t>
-            </w:r>
-            <w:r>
-              <w:rPr>
-                <w:rFonts w:ascii="Latha" w:hAnsi="Latha" w:cs="Latha"/>
-                <w:sz w:val="28"/>
-                <w:szCs w:val="28"/>
-                <w:lang w:val="it-IT" w:bidi="ta-IN"/>
-              </w:rPr>
-              <w:t xml:space="preserve"> </w:t>
-            </w:r>
-            <w:r>
-              <w:rPr>
-                <w:rFonts w:ascii="Latha" w:hAnsi="Latha" w:cs="Latha"/>
-                <w:sz w:val="28"/>
-                <w:szCs w:val="28"/>
-                <w:cs/>
-                <w:lang w:bidi="ta-IN"/>
-              </w:rPr>
-              <w:t>இதி</w:t>
-            </w:r>
-            <w:r>
-              <w:rPr>
-                <w:rFonts w:ascii="BRH Tamil Tab Extra" w:hAnsi="BRH Tamil Tab Extra" w:cs="Latha"/>
-                <w:b/>
-                <w:sz w:val="36"/>
-                <w:szCs w:val="28"/>
-                <w:lang w:val="it-IT" w:bidi="ta-IN"/>
-              </w:rPr>
-              <w:t>†</w:t>
-            </w:r>
-            <w:r>
-              <w:rPr>
-                <w:rFonts w:ascii="Latha" w:hAnsi="Latha" w:cs="Latha"/>
-                <w:sz w:val="28"/>
-                <w:szCs w:val="28"/>
-                <w:lang w:val="it-IT" w:bidi="ta-IN"/>
-              </w:rPr>
-              <w:t xml:space="preserve"> </w:t>
-            </w:r>
-            <w:r>
-              <w:rPr>
-                <w:rFonts w:ascii="Latha" w:hAnsi="Latha" w:cs="Latha"/>
-                <w:sz w:val="28"/>
-                <w:szCs w:val="28"/>
-                <w:cs/>
-                <w:lang w:bidi="ta-IN"/>
-              </w:rPr>
-              <w:t>ப்</w:t>
-            </w:r>
-            <w:r>
-              <w:rPr>
-                <w:rFonts w:ascii="Latha" w:hAnsi="Latha" w:cs="Latha"/>
-                <w:b/>
-                <w:bCs/>
-                <w:position w:val="-12"/>
-                <w:sz w:val="28"/>
-                <w:szCs w:val="28"/>
-                <w:cs/>
-                <w:lang w:bidi="ta-IN"/>
-              </w:rPr>
-              <w:t>3</w:t>
-            </w:r>
-            <w:r>
-              <w:rPr>
-                <w:rFonts w:ascii="Latha" w:hAnsi="Latha" w:cs="Latha"/>
-                <w:b/>
-                <w:bCs/>
-                <w:i/>
-                <w:iCs/>
-                <w:sz w:val="28"/>
-                <w:szCs w:val="28"/>
-                <w:cs/>
-                <w:lang w:bidi="ta-IN"/>
-              </w:rPr>
-              <w:t>ரு</w:t>
-            </w:r>
-            <w:r>
-              <w:rPr>
-                <w:rFonts w:ascii="Latha" w:hAnsi="Latha" w:cs="Latha"/>
-                <w:sz w:val="28"/>
-                <w:szCs w:val="28"/>
-                <w:cs/>
-                <w:lang w:bidi="ta-IN"/>
-              </w:rPr>
-              <w:t>ஹஸ்பதே</w:t>
-            </w:r>
-            <w:r>
-              <w:rPr>
-                <w:rFonts w:ascii="Latha" w:hAnsi="Latha" w:cs="Latha"/>
-                <w:sz w:val="28"/>
-                <w:szCs w:val="28"/>
-                <w:lang w:val="it-IT" w:bidi="ta-IN"/>
-              </w:rPr>
-              <w:t xml:space="preserve"> ||</w:t>
-            </w:r>
-          </w:p>
-        </w:tc>
-      </w:tr>
-      <w:tr>
-        <w:trPr>
-          <w:trHeight w:val="918"/>
-        </w:trPr>
-        <w:tc>
-          <w:tcPr>
-            <w:tcW w:w="3877" w:type="dxa"/>
-            <w:shd w:val="clear" w:color="auto" w:fill="auto"/>
-          </w:tcPr>
-          <w:p>
-            <w:pPr>
-              <w:widowControl w:val="0"/>
-              <w:tabs>
-                <w:tab w:val="left" w:pos="993"/>
-              </w:tabs>
-              <w:autoSpaceDE w:val="0"/>
-              <w:autoSpaceDN w:val="0"/>
-              <w:adjustRightInd w:val="0"/>
-              <w:spacing w:before="0" w:line="252" w:lineRule="auto"/>
-              <w:ind w:right="297"/>
-              <w:rPr>
-                <w:rFonts w:cs="Arial"/>
-                <w:b/>
-                <w:sz w:val="28"/>
-                <w:szCs w:val="32"/>
-              </w:rPr>
-            </w:pPr>
-            <w:r>
-              <w:rPr>
-                <w:rFonts w:cs="Arial"/>
-                <w:b/>
-                <w:sz w:val="28"/>
-                <w:szCs w:val="32"/>
-              </w:rPr>
-              <w:t>T.S.5.</w:t>
-            </w:r>
-            <w:r>
-              <w:rPr>
-                <w:rFonts w:cs="Arial"/>
-                <w:b/>
-                <w:sz w:val="28"/>
-                <w:szCs w:val="32"/>
-              </w:rPr>
-              <w:t>7.5.5</w:t>
-            </w:r>
-            <w:r>
-              <w:rPr>
-                <w:rFonts w:cs="Arial"/>
-                <w:b/>
-                <w:sz w:val="28"/>
-                <w:szCs w:val="32"/>
-              </w:rPr>
-              <w:t>– Kramam</w:t>
-            </w:r>
-          </w:p>
-          <w:p>
-            <w:pPr>
-              <w:widowControl w:val="0"/>
-              <w:tabs>
-                <w:tab w:val="left" w:pos="993"/>
-              </w:tabs>
-              <w:autoSpaceDE w:val="0"/>
-              <w:autoSpaceDN w:val="0"/>
-              <w:adjustRightInd w:val="0"/>
-              <w:spacing w:before="0" w:line="252" w:lineRule="auto"/>
-              <w:ind w:right="297"/>
-              <w:rPr>
-                <w:rFonts w:cs="Arial"/>
-                <w:b/>
-                <w:sz w:val="28"/>
-                <w:szCs w:val="32"/>
-                <w:lang w:val="en-IN"/>
-              </w:rPr>
-            </w:pPr>
-            <w:r>
-              <w:rPr>
-                <w:rFonts w:cs="Arial"/>
-                <w:b/>
-                <w:sz w:val="28"/>
-                <w:szCs w:val="32"/>
-                <w:lang w:val="en-IN"/>
-              </w:rPr>
-              <w:t>Krama Vaakyam No.– 49</w:t>
-            </w:r>
-          </w:p>
-          <w:p>
-            <w:pPr>
-              <w:widowControl w:val="0"/>
-              <w:tabs>
-                <w:tab w:val="left" w:pos="993"/>
-              </w:tabs>
-              <w:autoSpaceDE w:val="0"/>
-              <w:autoSpaceDN w:val="0"/>
-              <w:adjustRightInd w:val="0"/>
-              <w:spacing w:before="0" w:line="252" w:lineRule="auto"/>
-              <w:ind w:right="297"/>
-              <w:rPr>
-                <w:rFonts w:cs="Arial"/>
-                <w:b/>
-                <w:sz w:val="28"/>
-                <w:szCs w:val="32"/>
-                <w:lang w:val="it-IT"/>
-              </w:rPr>
-            </w:pPr>
-            <w:r>
-              <w:rPr>
-                <w:rFonts w:cs="Arial"/>
-                <w:b/>
-                <w:sz w:val="28"/>
-                <w:szCs w:val="32"/>
-                <w:lang w:val="it-IT"/>
-              </w:rPr>
-              <w:t>Panchaati No</w:t>
-            </w:r>
-            <w:r>
-              <w:rPr>
-                <w:rFonts w:cs="Arial"/>
-                <w:b/>
-                <w:szCs w:val="32"/>
-                <w:lang w:val="it-IT"/>
-              </w:rPr>
-              <w:t xml:space="preserve">. - </w:t>
-            </w:r>
-            <w:r>
-              <w:rPr>
-                <w:rFonts w:cs="Arial"/>
-                <w:b/>
-                <w:sz w:val="28"/>
-                <w:szCs w:val="32"/>
-                <w:lang w:val="it-IT"/>
-              </w:rPr>
-              <w:t>2</w:t>
-            </w:r>
-            <w:r>
-              <w:rPr>
-                <w:rFonts w:cs="Arial"/>
-                <w:b/>
-                <w:sz w:val="28"/>
-                <w:szCs w:val="32"/>
-                <w:lang w:val="it-IT"/>
-              </w:rPr>
-              <w:t>1</w:t>
-            </w:r>
-          </w:p>
-        </w:tc>
-        <w:tc>
-          <w:tcPr>
-            <w:tcW w:w="4678" w:type="dxa"/>
-            <w:shd w:val="clear" w:color="auto" w:fill="auto"/>
-          </w:tcPr>
-          <w:p>
-            <w:pPr>
-              <w:widowControl w:val="0"/>
-              <w:autoSpaceDE w:val="0"/>
-              <w:autoSpaceDN w:val="0"/>
-              <w:adjustRightInd w:val="0"/>
-              <w:spacing w:before="0" w:line="240" w:lineRule="auto"/>
-              <w:rPr>
-                <w:rFonts w:ascii="BRH Malayalam Extra" w:eastAsia="Times New Roman" w:hAnsi="BRH Malayalam Extra" w:cs="BRH Malayalam Extra"/>
-                <w:color w:val="000000"/>
-                <w:sz w:val="40"/>
-                <w:szCs w:val="40"/>
-                <w:lang w:val="en-IN" w:eastAsia="en-IN" w:bidi="ml-IN"/>
-              </w:rPr>
-            </w:pPr>
-            <w:r>
-              <w:rPr>
-                <w:rFonts w:ascii="Latha" w:hAnsi="Latha" w:cs="Latha"/>
-                <w:sz w:val="28"/>
-                <w:szCs w:val="28"/>
-                <w:cs/>
-                <w:lang w:bidi="ta-IN"/>
-              </w:rPr>
-              <w:t>ப்ர</w:t>
-            </w:r>
-            <w:r>
-              <w:rPr>
-                <w:rFonts w:ascii="BRH Tamil Tab Extra" w:hAnsi="BRH Tamil Tab Extra" w:cs="Latha"/>
-                <w:b/>
-                <w:sz w:val="32"/>
-                <w:szCs w:val="28"/>
-                <w:lang w:bidi="ta-IN"/>
-              </w:rPr>
-              <w:t>……</w:t>
-            </w:r>
-            <w:r>
-              <w:rPr>
-                <w:rFonts w:ascii="Latha" w:hAnsi="Latha" w:cs="Latha"/>
-                <w:sz w:val="28"/>
-                <w:szCs w:val="28"/>
-                <w:cs/>
-                <w:lang w:bidi="ta-IN"/>
-              </w:rPr>
-              <w:t>ஜாப</w:t>
-            </w:r>
-            <w:r>
-              <w:rPr>
-                <w:rFonts w:ascii="BRH Tamil Tab Extra" w:hAnsi="BRH Tamil Tab Extra" w:cs="Latha"/>
-                <w:b/>
-                <w:sz w:val="36"/>
-                <w:szCs w:val="28"/>
-                <w:lang w:bidi="ta-IN"/>
-              </w:rPr>
-              <w:t>†</w:t>
-            </w:r>
-            <w:r>
-              <w:rPr>
-                <w:rFonts w:ascii="Latha" w:hAnsi="Latha" w:cs="Latha"/>
-                <w:sz w:val="28"/>
-                <w:szCs w:val="28"/>
-                <w:cs/>
-                <w:lang w:bidi="ta-IN"/>
-              </w:rPr>
-              <w:t>திமப்</w:t>
-            </w:r>
-            <w:r>
-              <w:rPr>
-                <w:rFonts w:ascii="Latha" w:hAnsi="Latha" w:cs="Latha"/>
-                <w:b/>
-                <w:bCs/>
-                <w:position w:val="-12"/>
-                <w:sz w:val="28"/>
-                <w:szCs w:val="28"/>
-                <w:cs/>
-                <w:lang w:bidi="ta-IN"/>
-              </w:rPr>
-              <w:t>3</w:t>
-            </w:r>
-            <w:r>
-              <w:rPr>
-                <w:rFonts w:ascii="Latha" w:hAnsi="Latha" w:cs="Latha"/>
-                <w:sz w:val="28"/>
-                <w:szCs w:val="28"/>
-                <w:cs/>
-                <w:lang w:bidi="ta-IN"/>
-              </w:rPr>
-              <w:t>ர</w:t>
-            </w:r>
-            <w:r>
-              <w:rPr>
-                <w:rFonts w:ascii="Latha" w:hAnsi="Latha" w:cs="Latha"/>
-                <w:sz w:val="28"/>
-                <w:szCs w:val="28"/>
-                <w:highlight w:val="yellow"/>
-                <w:cs/>
-                <w:lang w:bidi="ta-IN"/>
-              </w:rPr>
-              <w:t>வி</w:t>
-            </w:r>
-            <w:r>
-              <w:rPr>
-                <w:rFonts w:ascii="Latha" w:hAnsi="Latha" w:cs="Latha"/>
-                <w:sz w:val="28"/>
-                <w:szCs w:val="28"/>
-                <w:cs/>
-                <w:lang w:bidi="ta-IN"/>
-              </w:rPr>
-              <w:t>த்</w:t>
-            </w:r>
-            <w:r>
-              <w:rPr>
-                <w:rFonts w:ascii="Latha" w:hAnsi="Latha" w:cs="Latha"/>
-                <w:sz w:val="28"/>
-                <w:szCs w:val="28"/>
-                <w:lang w:bidi="ta-IN"/>
-              </w:rPr>
-              <w:t xml:space="preserve"> |</w:t>
-            </w:r>
-          </w:p>
-        </w:tc>
-        <w:tc>
-          <w:tcPr>
-            <w:tcW w:w="5280" w:type="dxa"/>
-            <w:shd w:val="clear" w:color="auto" w:fill="auto"/>
-          </w:tcPr>
-          <w:p>
-            <w:pPr>
-              <w:widowControl w:val="0"/>
-              <w:autoSpaceDE w:val="0"/>
-              <w:autoSpaceDN w:val="0"/>
-              <w:adjustRightInd w:val="0"/>
-              <w:spacing w:before="0" w:line="240" w:lineRule="auto"/>
-              <w:rPr>
-                <w:rFonts w:ascii="BRH Malayalam Extra" w:eastAsia="Times New Roman" w:hAnsi="BRH Malayalam Extra" w:cs="BRH Malayalam Extra"/>
-                <w:color w:val="000000"/>
-                <w:sz w:val="40"/>
-                <w:szCs w:val="40"/>
-                <w:lang w:eastAsia="en-IN" w:bidi="ml-IN"/>
+                <w:rFonts w:ascii="Latha" w:hAnsi="Latha" w:cs="Latha"/>
+                <w:sz w:val="28"/>
+                <w:szCs w:val="28"/>
+                <w:cs/>
+                <w:lang w:bidi="ta-IN"/>
               </w:rPr>
             </w:pPr>
             <w:r>
@@ -1266,7 +687,7 @@
                 <w:sz w:val="28"/>
                 <w:szCs w:val="32"/>
               </w:rPr>
-              <w:t>10.2</w:t>
+              <w:t>6.3</w:t>
             </w:r>
             <w:r>
               <w:rPr>
@@ -1305,7 +726,7 @@
                 <w:szCs w:val="32"/>
                 <w:lang w:val="en-IN"/>
               </w:rPr>
-              <w:t>Krama Vaakyam No.6</w:t>
+              <w:t>Krama Vaakyam No.– 53</w:t>
             </w:r>
           </w:p>
           <w:p>
@@ -1354,7 +775,17 @@
                 <w:szCs w:val="32"/>
                 <w:lang w:val="it-IT"/>
               </w:rPr>
-              <w:t>41</w:t>
+              <w:t>2</w:t>
+            </w:r>
+            <w:r>
+              <w:rPr>
+                <w:rFonts w:cs="Arial"/>
+                <w:b/>
+                <w:sz w:val="28"/>
+                <w:szCs w:val="32"/>
+                <w:lang w:val="it-IT"/>
+              </w:rPr>
+              <w:t>6</w:t>
             </w:r>
           </w:p>
         </w:tc>
@@ -1388,47 +819,6 @@
                 <w:rFonts w:ascii="Latha" w:hAnsi="Latha" w:cs="Latha"/>
                 <w:sz w:val="28"/>
                 <w:szCs w:val="28"/>
-                <w:highlight w:val="yellow"/>
-                <w:cs/>
-                <w:lang w:bidi="ta-IN"/>
-              </w:rPr>
-              <w:t>பா</w:t>
-            </w:r>
-            <w:r>
-              <w:rPr>
-                <w:rFonts w:ascii="BRH Tamil Tab Extra" w:hAnsi="BRH Tamil Tab Extra" w:cs="Latha"/>
-                <w:b/>
-                <w:sz w:val="32"/>
-                <w:szCs w:val="28"/>
-                <w:lang w:val="it-IT" w:bidi="ta-IN"/>
-              </w:rPr>
-              <w:t>……</w:t>
-            </w:r>
-            <w:r>
-              <w:rPr>
-                <w:rFonts w:ascii="Latha" w:hAnsi="Latha" w:cs="Latha"/>
-                <w:sz w:val="28"/>
-                <w:szCs w:val="28"/>
-                <w:cs/>
-                <w:lang w:bidi="ta-IN"/>
-              </w:rPr>
-              <w:t>ண</w:t>
-            </w:r>
-            <w:r>
-              <w:rPr>
-                <w:rFonts w:ascii="BRH Tamil Tab Extra" w:hAnsi="BRH Tamil Tab Extra" w:cs="Latha"/>
-                <w:b/>
-                <w:sz w:val="32"/>
-                <w:szCs w:val="28"/>
-                <w:lang w:val="it-IT" w:bidi="ta-IN"/>
-              </w:rPr>
-              <w:t>……</w:t>
-            </w:r>
-            <w:r>
-              <w:rPr>
-                <w:rFonts w:ascii="Latha" w:hAnsi="Latha" w:cs="Latha"/>
-                <w:sz w:val="28"/>
-                <w:szCs w:val="28"/>
                 <w:cs/>
                 <w:lang w:bidi="ta-IN"/>
               </w:rPr>
@@ -1445,7 +835,7 @@
                 <w:cs/>
                 <w:lang w:bidi="ta-IN"/>
               </w:rPr>
-              <w:t>4</w:t>
+              <w:t>3</w:t>
             </w:r>
             <w:r>
               <w:rPr>
@@ -1463,16 +853,6 @@
             </w:r>
             <w:r>
               <w:rPr>
-                <w:rFonts w:ascii="Latha" w:hAnsi="Latha" w:cs="Latha"/>
-                <w:sz w:val="28"/>
-                <w:szCs w:val="28"/>
-                <w:cs/>
-                <w:lang w:bidi="ta-IN"/>
-              </w:rPr>
-              <w:t>த</w:t>
-            </w:r>
-            <w:r>
-              <w:rPr>
                 <w:rFonts w:ascii="BRH Tamil Tab Extra" w:hAnsi="BRH Tamil Tab Extra" w:cs="Latha"/>
                 <w:b/>
                 <w:sz w:val="32"/>
@@ -1489,7 +869,77 @@
                 <w:cs/>
                 <w:lang w:bidi="ta-IN"/>
               </w:rPr>
-              <w:t>ஶ்சக்ஷு</w:t>
+              <w:t>ஹ</w:t>
+            </w:r>
+            <w:r>
+              <w:rPr>
+                <w:rFonts w:ascii="BRH Tamil Tab Extra" w:hAnsi="BRH Tamil Tab Extra" w:cs="Latha"/>
+                <w:b/>
+                <w:sz w:val="32"/>
+                <w:szCs w:val="28"/>
+                <w:lang w:val="it-IT" w:bidi="ta-IN"/>
+              </w:rPr>
+              <w:t>……</w:t>
+            </w:r>
+            <w:r>
+              <w:rPr>
+                <w:rFonts w:ascii="Latha" w:hAnsi="Latha" w:cs="Latha"/>
+                <w:sz w:val="28"/>
+                <w:szCs w:val="28"/>
+                <w:cs/>
+                <w:lang w:bidi="ta-IN"/>
+              </w:rPr>
+              <w:t>ஸ்ப</w:t>
+            </w:r>
+            <w:r>
+              <w:rPr>
+                <w:rFonts w:ascii="BRH Tamil Tab Extra" w:hAnsi="BRH Tamil Tab Extra" w:cs="Latha"/>
+                <w:b/>
+                <w:sz w:val="32"/>
+                <w:szCs w:val="28"/>
+                <w:lang w:val="it-IT" w:bidi="ta-IN"/>
+              </w:rPr>
+              <w:t>……</w:t>
+            </w:r>
+            <w:r>
+              <w:rPr>
+                <w:rFonts w:ascii="Latha" w:hAnsi="Latha" w:cs="Latha"/>
+                <w:sz w:val="28"/>
+                <w:szCs w:val="28"/>
+                <w:highlight w:val="yellow"/>
+                <w:cs/>
+                <w:lang w:bidi="ta-IN"/>
+              </w:rPr>
+              <w:t>தே</w:t>
+            </w:r>
+            <w:r>
+              <w:rPr>
+                <w:rFonts w:ascii="BRH Tamil Tab Extra" w:hAnsi="BRH Tamil Tab Extra" w:cs="Latha"/>
+                <w:b/>
+                <w:sz w:val="32"/>
+                <w:szCs w:val="28"/>
+                <w:lang w:val="it-IT" w:bidi="ta-IN"/>
+              </w:rPr>
+              <w:t>……</w:t>
+            </w:r>
+            <w:r>
+              <w:rPr>
+                <w:rFonts w:ascii="Latha" w:hAnsi="Latha" w:cs="Latha"/>
+                <w:sz w:val="28"/>
+                <w:szCs w:val="28"/>
+                <w:lang w:val="it-IT" w:bidi="ta-IN"/>
+              </w:rPr>
+              <w:t xml:space="preserve"> </w:t>
+            </w:r>
+            <w:r>
+              <w:rPr>
+                <w:rFonts w:ascii="Latha" w:hAnsi="Latha" w:cs="Latha"/>
+                <w:sz w:val="28"/>
+                <w:szCs w:val="28"/>
+                <w:cs/>
+                <w:lang w:bidi="ta-IN"/>
+              </w:rPr>
+              <w:t>இதி</w:t>
             </w:r>
             <w:r>
               <w:rPr>
@@ -1506,22 +956,56 @@
                 <w:rFonts w:ascii="Latha" w:hAnsi="Latha" w:cs="Latha"/>
                 <w:sz w:val="28"/>
                 <w:szCs w:val="28"/>
-                <w:cs/>
-                <w:lang w:bidi="ta-IN"/>
-              </w:rPr>
-              <w:t>ஷ்மதீ</w:t>
+                <w:lang w:val="it-IT" w:bidi="ta-IN"/>
+              </w:rPr>
+              <w:t xml:space="preserve"> </w:t>
+            </w:r>
+            <w:r>
+              <w:rPr>
+                <w:rFonts w:ascii="Latha" w:hAnsi="Latha" w:cs="Latha"/>
+                <w:sz w:val="28"/>
+                <w:szCs w:val="28"/>
+                <w:cs/>
+                <w:lang w:bidi="ta-IN"/>
+              </w:rPr>
+              <w:t>ப்</w:t>
             </w:r>
             <w:r>
               <w:rPr>
                 <w:rFonts w:ascii="Latha" w:hAnsi="Latha" w:cs="Latha"/>
                 <w:b/>
                 <w:bCs/>
-                <w:sz w:val="32"/>
-                <w:szCs w:val="32"/>
-                <w:cs/>
-                <w:lang w:bidi="ta-IN"/>
-              </w:rPr>
-              <w:t>:</w:t>
+                <w:position w:val="-12"/>
+                <w:sz w:val="28"/>
+                <w:szCs w:val="28"/>
+                <w:cs/>
+                <w:lang w:bidi="ta-IN"/>
+              </w:rPr>
+              <w:t>3</w:t>
+            </w:r>
+            <w:r>
+              <w:rPr>
+                <w:rFonts w:ascii="Latha" w:hAnsi="Latha" w:cs="Latha"/>
+                <w:b/>
+                <w:bCs/>
+                <w:i/>
+                <w:iCs/>
+                <w:sz w:val="28"/>
+                <w:szCs w:val="28"/>
+                <w:cs/>
+                <w:lang w:bidi="ta-IN"/>
+              </w:rPr>
+              <w:t>ரு</w:t>
+            </w:r>
+            <w:r>
+              <w:rPr>
+                <w:rFonts w:ascii="Latha" w:hAnsi="Latha" w:cs="Latha"/>
+                <w:sz w:val="28"/>
+                <w:szCs w:val="28"/>
+                <w:cs/>
+                <w:lang w:bidi="ta-IN"/>
+              </w:rPr>
+              <w:t>ஹஸ்பதே</w:t>
             </w:r>
             <w:r>
               <w:rPr>
@@ -1530,7 +1014,7 @@
                 <w:szCs w:val="28"/>
                 <w:lang w:val="it-IT" w:bidi="ta-IN"/>
               </w:rPr>
-              <w:t xml:space="preserve"> |</w:t>
+              <w:t xml:space="preserve"> ||</w:t>
             </w:r>
           </w:p>
         </w:tc>
@@ -1561,47 +1045,6 @@
                 <w:rFonts w:ascii="Latha" w:hAnsi="Latha" w:cs="Latha"/>
                 <w:sz w:val="28"/>
                 <w:szCs w:val="28"/>
-                <w:highlight w:val="green"/>
-                <w:cs/>
-                <w:lang w:bidi="ta-IN"/>
-              </w:rPr>
-              <w:t>ப்ரா</w:t>
-            </w:r>
-            <w:r>
-              <w:rPr>
-                <w:rFonts w:ascii="BRH Tamil Tab Extra" w:hAnsi="BRH Tamil Tab Extra" w:cs="Latha"/>
-                <w:b/>
-                <w:sz w:val="32"/>
-                <w:szCs w:val="28"/>
-                <w:lang w:val="it-IT" w:bidi="ta-IN"/>
-              </w:rPr>
-              <w:t>……</w:t>
-            </w:r>
-            <w:r>
-              <w:rPr>
-                <w:rFonts w:ascii="Latha" w:hAnsi="Latha" w:cs="Latha"/>
-                <w:sz w:val="28"/>
-                <w:szCs w:val="28"/>
-                <w:cs/>
-                <w:lang w:bidi="ta-IN"/>
-              </w:rPr>
-              <w:t>ண</w:t>
-            </w:r>
-            <w:r>
-              <w:rPr>
-                <w:rFonts w:ascii="BRH Tamil Tab Extra" w:hAnsi="BRH Tamil Tab Extra" w:cs="Latha"/>
-                <w:b/>
-                <w:sz w:val="32"/>
-                <w:szCs w:val="28"/>
-                <w:lang w:val="it-IT" w:bidi="ta-IN"/>
-              </w:rPr>
-              <w:t>……</w:t>
-            </w:r>
-            <w:r>
-              <w:rPr>
-                <w:rFonts w:ascii="Latha" w:hAnsi="Latha" w:cs="Latha"/>
-                <w:sz w:val="28"/>
-                <w:szCs w:val="28"/>
                 <w:cs/>
                 <w:lang w:bidi="ta-IN"/>
               </w:rPr>
@@ -1618,7 +1061,7 @@
                 <w:cs/>
                 <w:lang w:bidi="ta-IN"/>
               </w:rPr>
-              <w:t>4</w:t>
+              <w:t>3</w:t>
             </w:r>
             <w:r>
               <w:rPr>
@@ -1636,9 +1079,60 @@
             </w:r>
             <w:r>
               <w:rPr>
-                <w:rFonts w:ascii="Latha" w:hAnsi="Latha" w:cs="Latha"/>
-                <w:sz w:val="28"/>
-                <w:szCs w:val="28"/>
+                <w:rFonts w:ascii="BRH Tamil Tab Extra" w:hAnsi="BRH Tamil Tab Extra" w:cs="Latha"/>
+                <w:b/>
+                <w:sz w:val="32"/>
+                <w:szCs w:val="28"/>
+                <w:lang w:val="it-IT" w:bidi="ta-IN"/>
+              </w:rPr>
+              <w:t>……</w:t>
+            </w:r>
+            <w:r>
+              <w:rPr>
+                <w:rFonts w:ascii="Latha" w:hAnsi="Latha" w:cs="Latha"/>
+                <w:sz w:val="28"/>
+                <w:szCs w:val="28"/>
+                <w:cs/>
+                <w:lang w:bidi="ta-IN"/>
+              </w:rPr>
+              <w:t>ஹ</w:t>
+            </w:r>
+            <w:r>
+              <w:rPr>
+                <w:rFonts w:ascii="BRH Tamil Tab Extra" w:hAnsi="BRH Tamil Tab Extra" w:cs="Latha"/>
+                <w:b/>
+                <w:sz w:val="32"/>
+                <w:szCs w:val="28"/>
+                <w:lang w:val="it-IT" w:bidi="ta-IN"/>
+              </w:rPr>
+              <w:t>……</w:t>
+            </w:r>
+            <w:r>
+              <w:rPr>
+                <w:rFonts w:ascii="Latha" w:hAnsi="Latha" w:cs="Latha"/>
+                <w:sz w:val="28"/>
+                <w:szCs w:val="28"/>
+                <w:cs/>
+                <w:lang w:bidi="ta-IN"/>
+              </w:rPr>
+              <w:t>ஸ்ப</w:t>
+            </w:r>
+            <w:r>
+              <w:rPr>
+                <w:rFonts w:ascii="BRH Tamil Tab Extra" w:hAnsi="BRH Tamil Tab Extra" w:cs="Latha"/>
+                <w:b/>
+                <w:sz w:val="32"/>
+                <w:szCs w:val="28"/>
+                <w:lang w:val="it-IT" w:bidi="ta-IN"/>
+              </w:rPr>
+              <w:t>……</w:t>
+            </w:r>
+            <w:r>
+              <w:rPr>
+                <w:rFonts w:ascii="Latha" w:hAnsi="Latha" w:cs="Latha"/>
+                <w:sz w:val="28"/>
+                <w:szCs w:val="28"/>
+                <w:highlight w:val="green"/>
                 <w:cs/>
                 <w:lang w:bidi="ta-IN"/>
               </w:rPr>
@@ -1659,10 +1153,19 @@
                 <w:rFonts w:ascii="Latha" w:hAnsi="Latha" w:cs="Latha"/>
                 <w:sz w:val="28"/>
                 <w:szCs w:val="28"/>
-                <w:cs/>
-                <w:lang w:bidi="ta-IN"/>
-              </w:rPr>
-              <w:t>ஶ்சக்ஷு</w:t>
+                <w:lang w:val="it-IT" w:bidi="ta-IN"/>
+              </w:rPr>
+              <w:t xml:space="preserve"> </w:t>
+            </w:r>
+            <w:r>
+              <w:rPr>
+                <w:rFonts w:ascii="Latha" w:hAnsi="Latha" w:cs="Latha"/>
+                <w:sz w:val="28"/>
+                <w:szCs w:val="28"/>
+                <w:cs/>
+                <w:lang w:bidi="ta-IN"/>
+              </w:rPr>
+              <w:t>இதி</w:t>
             </w:r>
             <w:r>
               <w:rPr>
@@ -1679,22 +1182,56 @@
                 <w:rFonts w:ascii="Latha" w:hAnsi="Latha" w:cs="Latha"/>
                 <w:sz w:val="28"/>
                 <w:szCs w:val="28"/>
-                <w:cs/>
-                <w:lang w:bidi="ta-IN"/>
-              </w:rPr>
-              <w:t>ஷ்மதீ</w:t>
+                <w:lang w:val="it-IT" w:bidi="ta-IN"/>
+              </w:rPr>
+              <w:t xml:space="preserve"> </w:t>
+            </w:r>
+            <w:r>
+              <w:rPr>
+                <w:rFonts w:ascii="Latha" w:hAnsi="Latha" w:cs="Latha"/>
+                <w:sz w:val="28"/>
+                <w:szCs w:val="28"/>
+                <w:cs/>
+                <w:lang w:bidi="ta-IN"/>
+              </w:rPr>
+              <w:t>ப்</w:t>
             </w:r>
             <w:r>
               <w:rPr>
                 <w:rFonts w:ascii="Latha" w:hAnsi="Latha" w:cs="Latha"/>
                 <w:b/>
                 <w:bCs/>
-                <w:sz w:val="32"/>
-                <w:szCs w:val="32"/>
-                <w:cs/>
-                <w:lang w:bidi="ta-IN"/>
-              </w:rPr>
-              <w:t>:</w:t>
+                <w:position w:val="-12"/>
+                <w:sz w:val="28"/>
+                <w:szCs w:val="28"/>
+                <w:cs/>
+                <w:lang w:bidi="ta-IN"/>
+              </w:rPr>
+              <w:t>3</w:t>
+            </w:r>
+            <w:r>
+              <w:rPr>
+                <w:rFonts w:ascii="Latha" w:hAnsi="Latha" w:cs="Latha"/>
+                <w:b/>
+                <w:bCs/>
+                <w:i/>
+                <w:iCs/>
+                <w:sz w:val="28"/>
+                <w:szCs w:val="28"/>
+                <w:cs/>
+                <w:lang w:bidi="ta-IN"/>
+              </w:rPr>
+              <w:t>ரு</w:t>
+            </w:r>
+            <w:r>
+              <w:rPr>
+                <w:rFonts w:ascii="Latha" w:hAnsi="Latha" w:cs="Latha"/>
+                <w:sz w:val="28"/>
+                <w:szCs w:val="28"/>
+                <w:cs/>
+                <w:lang w:bidi="ta-IN"/>
+              </w:rPr>
+              <w:t>ஹஸ்பதே</w:t>
             </w:r>
             <w:r>
               <w:rPr>
@@ -1703,19 +1240,24 @@
                 <w:szCs w:val="28"/>
                 <w:lang w:val="it-IT" w:bidi="ta-IN"/>
               </w:rPr>
-              <w:t xml:space="preserve"> |</w:t>
+              <w:t xml:space="preserve"> ||</w:t>
             </w:r>
           </w:p>
         </w:tc>
       </w:tr>
       <w:tr>
         <w:trPr>
-          <w:trHeight w:val="918"/>
+          <w:trHeight w:val="964"/>
         </w:trPr>
         <w:tc>
           <w:tcPr>
             <w:tcW w:w="3877" w:type="dxa"/>
-            <w:shd w:val="clear" w:color="auto" w:fill="auto"/>
+            <w:tcBorders>
+              <w:top w:val="single" w:sz="4" w:space="0" w:color="000000"/>
+              <w:left w:val="single" w:sz="4" w:space="0" w:color="000000"/>
+              <w:bottom w:val="single" w:sz="4" w:space="0" w:color="000000"/>
+              <w:right w:val="single" w:sz="4" w:space="0" w:color="000000"/>
+            </w:tcBorders>
           </w:tcPr>
           <w:p>
             <w:pPr>
@@ -1733,15 +1275,125 @@
                 <w:b/>
                 <w:sz w:val="28"/>
                 <w:szCs w:val="32"/>
+              </w:rPr>
+            </w:pPr>
+            <w:r>
+              <w:rPr>
+                <w:rFonts w:cs="Arial"/>
+                <w:b/>
+                <w:sz w:val="28"/>
+                <w:szCs w:val="32"/>
+              </w:rPr>
+              <w:t>T.S.5.7.</w:t>
+            </w:r>
+            <w:r>
+              <w:rPr>
+                <w:rFonts w:cs="Arial"/>
+                <w:b/>
+                <w:sz w:val="28"/>
+                <w:szCs w:val="32"/>
+              </w:rPr>
+              <w:t>10.2</w:t>
+            </w:r>
+            <w:r>
+              <w:rPr>
+                <w:rFonts w:cs="Arial"/>
+                <w:b/>
+                <w:sz w:val="28"/>
+                <w:szCs w:val="32"/>
+              </w:rPr>
+              <w:t xml:space="preserve"> – Kramam</w:t>
+            </w:r>
+          </w:p>
+          <w:p>
+            <w:pPr>
+              <w:widowControl w:val="0"/>
+              <w:tabs>
+                <w:tab w:val="left" w:pos="993"/>
+              </w:tabs>
+              <w:autoSpaceDE w:val="0"/>
+              <w:autoSpaceDN w:val="0"/>
+              <w:adjustRightInd w:val="0"/>
+              <w:spacing w:before="0" w:line="252" w:lineRule="auto"/>
+              <w:ind w:right="297"/>
+              <w:rPr>
+                <w:rFonts w:cs="Arial"/>
+                <w:b/>
+                <w:sz w:val="28"/>
+                <w:szCs w:val="32"/>
+                <w:lang w:val="en-IN"/>
+              </w:rPr>
+            </w:pPr>
+            <w:r>
+              <w:rPr>
+                <w:rFonts w:cs="Arial"/>
+                <w:b/>
+                <w:sz w:val="28"/>
+                <w:szCs w:val="32"/>
+                <w:lang w:val="en-IN"/>
+              </w:rPr>
+              <w:t>Krama Vaakyam No.6</w:t>
+            </w:r>
+          </w:p>
+          <w:p>
+            <w:pPr>
+              <w:widowControl w:val="0"/>
+              <w:tabs>
+                <w:tab w:val="left" w:pos="993"/>
+              </w:tabs>
+              <w:autoSpaceDE w:val="0"/>
+              <w:autoSpaceDN w:val="0"/>
+              <w:adjustRightInd w:val="0"/>
+              <w:spacing w:before="0" w:line="252" w:lineRule="auto"/>
+              <w:ind w:right="297"/>
+              <w:rPr>
+                <w:rFonts w:cs="Arial"/>
+                <w:b/>
+                <w:sz w:val="28"/>
+                <w:szCs w:val="32"/>
                 <w:lang w:val="it-IT"/>
               </w:rPr>
             </w:pPr>
+            <w:r>
+              <w:rPr>
+                <w:rFonts w:cs="Arial"/>
+                <w:b/>
+                <w:sz w:val="28"/>
+                <w:szCs w:val="32"/>
+                <w:lang w:val="it-IT"/>
+              </w:rPr>
+              <w:t>Panchaati No</w:t>
+            </w:r>
+            <w:r>
+              <w:rPr>
+                <w:rFonts w:cs="Arial"/>
+                <w:b/>
+                <w:szCs w:val="32"/>
+                <w:lang w:val="it-IT"/>
+              </w:rPr>
+              <w:t xml:space="preserve">. - </w:t>
+            </w:r>
+            <w:r>
+              <w:rPr>
+                <w:rFonts w:cs="Arial"/>
+                <w:b/>
+                <w:sz w:val="28"/>
+                <w:szCs w:val="32"/>
+                <w:lang w:val="it-IT"/>
+              </w:rPr>
+              <w:t>41</w:t>
+            </w:r>
           </w:p>
         </w:tc>
         <w:tc>
           <w:tcPr>
             <w:tcW w:w="4678" w:type="dxa"/>
-            <w:shd w:val="clear" w:color="auto" w:fill="auto"/>
+            <w:tcBorders>
+              <w:top w:val="single" w:sz="4" w:space="0" w:color="000000"/>
+              <w:left w:val="single" w:sz="4" w:space="0" w:color="000000"/>
+              <w:bottom w:val="single" w:sz="4" w:space="0" w:color="000000"/>
+              <w:right w:val="single" w:sz="4" w:space="0" w:color="000000"/>
+            </w:tcBorders>
           </w:tcPr>
           <w:p>
             <w:pPr>
@@ -1751,19 +1403,504 @@
               <w:adjustRightInd w:val="0"/>
               <w:spacing w:before="0" w:line="240" w:lineRule="auto"/>
               <w:rPr>
-                <w:rFonts w:ascii="Latha" w:hAnsi="Latha" w:cs="Latha"/>
-                <w:sz w:val="28"/>
-                <w:szCs w:val="28"/>
-                <w:cs/>
-                <w:lang w:bidi="ta-IN"/>
+                <w:rFonts w:ascii="BRH Malayalam Extra" w:eastAsia="Times New Roman" w:hAnsi="BRH Malayalam Extra" w:cs="BRH Malayalam Extra"/>
+                <w:color w:val="000000"/>
+                <w:sz w:val="40"/>
+                <w:szCs w:val="40"/>
+                <w:lang w:val="it-IT" w:eastAsia="en-IN" w:bidi="ml-IN"/>
               </w:rPr>
             </w:pPr>
+            <w:r>
+              <w:rPr>
+                <w:rFonts w:ascii="Latha" w:hAnsi="Latha" w:cs="Latha"/>
+                <w:sz w:val="28"/>
+                <w:szCs w:val="28"/>
+                <w:highlight w:val="yellow"/>
+                <w:cs/>
+                <w:lang w:bidi="ta-IN"/>
+              </w:rPr>
+              <w:t>பா</w:t>
+            </w:r>
+            <w:r>
+              <w:rPr>
+                <w:rFonts w:ascii="BRH Tamil Tab Extra" w:hAnsi="BRH Tamil Tab Extra" w:cs="Latha"/>
+                <w:b/>
+                <w:sz w:val="32"/>
+                <w:szCs w:val="28"/>
+                <w:lang w:val="it-IT" w:bidi="ta-IN"/>
+              </w:rPr>
+              <w:t>……</w:t>
+            </w:r>
+            <w:r>
+              <w:rPr>
+                <w:rFonts w:ascii="Latha" w:hAnsi="Latha" w:cs="Latha"/>
+                <w:sz w:val="28"/>
+                <w:szCs w:val="28"/>
+                <w:cs/>
+                <w:lang w:bidi="ta-IN"/>
+              </w:rPr>
+              <w:t>ண</w:t>
+            </w:r>
+            <w:r>
+              <w:rPr>
+                <w:rFonts w:ascii="BRH Tamil Tab Extra" w:hAnsi="BRH Tamil Tab Extra" w:cs="Latha"/>
+                <w:b/>
+                <w:sz w:val="32"/>
+                <w:szCs w:val="28"/>
+                <w:lang w:val="it-IT" w:bidi="ta-IN"/>
+              </w:rPr>
+              <w:t>……</w:t>
+            </w:r>
+            <w:r>
+              <w:rPr>
+                <w:rFonts w:ascii="Latha" w:hAnsi="Latha" w:cs="Latha"/>
+                <w:sz w:val="28"/>
+                <w:szCs w:val="28"/>
+                <w:cs/>
+                <w:lang w:bidi="ta-IN"/>
+              </w:rPr>
+              <w:t>ப்</w:t>
+            </w:r>
+            <w:r>
+              <w:rPr>
+                <w:rFonts w:ascii="Latha" w:hAnsi="Latha" w:cs="Latha"/>
+                <w:b/>
+                <w:bCs/>
+                <w:position w:val="-12"/>
+                <w:sz w:val="28"/>
+                <w:szCs w:val="28"/>
+                <w:cs/>
+                <w:lang w:bidi="ta-IN"/>
+              </w:rPr>
+              <w:t>4</w:t>
+            </w:r>
+            <w:r>
+              <w:rPr>
+                <w:rFonts w:ascii="Latha" w:hAnsi="Latha" w:cs="Latha"/>
+                <w:b/>
+                <w:bCs/>
+                <w:i/>
+                <w:iCs/>
+                <w:sz w:val="28"/>
+                <w:szCs w:val="28"/>
+                <w:cs/>
+                <w:lang w:bidi="ta-IN"/>
+              </w:rPr>
+              <w:t>ரு</w:t>
+            </w:r>
+            <w:r>
+              <w:rPr>
+                <w:rFonts w:ascii="Latha" w:hAnsi="Latha" w:cs="Latha"/>
+                <w:sz w:val="28"/>
+                <w:szCs w:val="28"/>
+                <w:cs/>
+                <w:lang w:bidi="ta-IN"/>
+              </w:rPr>
+              <w:t>த</w:t>
+            </w:r>
+            <w:r>
+              <w:rPr>
+                <w:rFonts w:ascii="BRH Tamil Tab Extra" w:hAnsi="BRH Tamil Tab Extra" w:cs="Latha"/>
+                <w:b/>
+                <w:sz w:val="32"/>
+                <w:szCs w:val="28"/>
+                <w:lang w:val="it-IT" w:bidi="ta-IN"/>
+              </w:rPr>
+              <w:t>……</w:t>
+            </w:r>
+            <w:r>
+              <w:rPr>
+                <w:rFonts w:ascii="Latha" w:hAnsi="Latha" w:cs="Latha"/>
+                <w:sz w:val="28"/>
+                <w:szCs w:val="28"/>
+                <w:cs/>
+                <w:lang w:bidi="ta-IN"/>
+              </w:rPr>
+              <w:t>ஶ்சக்ஷு</w:t>
+            </w:r>
+            <w:r>
+              <w:rPr>
+                <w:rFonts w:ascii="BRH Tamil Tab Extra" w:hAnsi="BRH Tamil Tab Extra" w:cs="Latha"/>
+                <w:b/>
+                <w:sz w:val="36"/>
+                <w:szCs w:val="28"/>
+                <w:lang w:val="it-IT" w:bidi="ta-IN"/>
+              </w:rPr>
+              <w:t>†</w:t>
+            </w:r>
+            <w:r>
+              <w:rPr>
+                <w:rFonts w:ascii="Latha" w:hAnsi="Latha" w:cs="Latha"/>
+                <w:sz w:val="28"/>
+                <w:szCs w:val="28"/>
+                <w:cs/>
+                <w:lang w:bidi="ta-IN"/>
+              </w:rPr>
+              <w:t>ஷ்மதீ</w:t>
+            </w:r>
+            <w:r>
+              <w:rPr>
+                <w:rFonts w:ascii="Latha" w:hAnsi="Latha" w:cs="Latha"/>
+                <w:b/>
+                <w:bCs/>
+                <w:sz w:val="32"/>
+                <w:szCs w:val="32"/>
+                <w:cs/>
+                <w:lang w:bidi="ta-IN"/>
+              </w:rPr>
+              <w:t>:</w:t>
+            </w:r>
+            <w:r>
+              <w:rPr>
+                <w:rFonts w:ascii="Latha" w:hAnsi="Latha" w:cs="Latha"/>
+                <w:sz w:val="28"/>
+                <w:szCs w:val="28"/>
+                <w:lang w:val="it-IT" w:bidi="ta-IN"/>
+              </w:rPr>
+              <w:t xml:space="preserve"> |</w:t>
+            </w:r>
           </w:p>
         </w:tc>
         <w:tc>
           <w:tcPr>
             <w:tcW w:w="5280" w:type="dxa"/>
-            <w:shd w:val="clear" w:color="auto" w:fill="auto"/>
+            <w:tcBorders>
+              <w:top w:val="single" w:sz="4" w:space="0" w:color="000000"/>
+              <w:left w:val="single" w:sz="4" w:space="0" w:color="000000"/>
+              <w:bottom w:val="single" w:sz="4" w:space="0" w:color="000000"/>
+              <w:right w:val="single" w:sz="4" w:space="0" w:color="000000"/>
+            </w:tcBorders>
+          </w:tcPr>
+          <w:p>
+            <w:pPr>
+              <w:spacing w:before="0" w:line="240" w:lineRule="auto"/>
+              <w:ind w:right="-106"/>
+              <w:rPr>
+                <w:rFonts w:ascii="BRH Malayalam Extra" w:eastAsia="Times New Roman" w:hAnsi="BRH Malayalam Extra" w:cs="BRH Malayalam Extra"/>
+                <w:color w:val="000000"/>
+                <w:sz w:val="40"/>
+                <w:szCs w:val="40"/>
+                <w:lang w:val="it-IT" w:eastAsia="en-IN" w:bidi="ml-IN"/>
+              </w:rPr>
+            </w:pPr>
+            <w:r>
+              <w:rPr>
+                <w:rFonts w:ascii="Latha" w:hAnsi="Latha" w:cs="Latha"/>
+                <w:sz w:val="28"/>
+                <w:szCs w:val="28"/>
+                <w:highlight w:val="green"/>
+                <w:cs/>
+                <w:lang w:bidi="ta-IN"/>
+              </w:rPr>
+              <w:t>ப்ரா</w:t>
+            </w:r>
+            <w:r>
+              <w:rPr>
+                <w:rFonts w:ascii="BRH Tamil Tab Extra" w:hAnsi="BRH Tamil Tab Extra" w:cs="Latha"/>
+                <w:b/>
+                <w:sz w:val="32"/>
+                <w:szCs w:val="28"/>
+                <w:lang w:val="it-IT" w:bidi="ta-IN"/>
+              </w:rPr>
+              <w:t>……</w:t>
+            </w:r>
+            <w:r>
+              <w:rPr>
+                <w:rFonts w:ascii="Latha" w:hAnsi="Latha" w:cs="Latha"/>
+                <w:sz w:val="28"/>
+                <w:szCs w:val="28"/>
+                <w:cs/>
+                <w:lang w:bidi="ta-IN"/>
+              </w:rPr>
+              <w:t>ண</w:t>
+            </w:r>
+            <w:r>
+              <w:rPr>
+                <w:rFonts w:ascii="BRH Tamil Tab Extra" w:hAnsi="BRH Tamil Tab Extra" w:cs="Latha"/>
+                <w:b/>
+                <w:sz w:val="32"/>
+                <w:szCs w:val="28"/>
+                <w:lang w:val="it-IT" w:bidi="ta-IN"/>
+              </w:rPr>
+              <w:t>……</w:t>
+            </w:r>
+            <w:r>
+              <w:rPr>
+                <w:rFonts w:ascii="Latha" w:hAnsi="Latha" w:cs="Latha"/>
+                <w:sz w:val="28"/>
+                <w:szCs w:val="28"/>
+                <w:cs/>
+                <w:lang w:bidi="ta-IN"/>
+              </w:rPr>
+              <w:t>ப்</w:t>
+            </w:r>
+            <w:r>
+              <w:rPr>
+                <w:rFonts w:ascii="Latha" w:hAnsi="Latha" w:cs="Latha"/>
+                <w:b/>
+                <w:bCs/>
+                <w:position w:val="-12"/>
+                <w:sz w:val="28"/>
+                <w:szCs w:val="28"/>
+                <w:cs/>
+                <w:lang w:bidi="ta-IN"/>
+              </w:rPr>
+              <w:t>4</w:t>
+            </w:r>
+            <w:r>
+              <w:rPr>
+                <w:rFonts w:ascii="Latha" w:hAnsi="Latha" w:cs="Latha"/>
+                <w:b/>
+                <w:bCs/>
+                <w:i/>
+                <w:iCs/>
+                <w:sz w:val="28"/>
+                <w:szCs w:val="28"/>
+                <w:cs/>
+                <w:lang w:bidi="ta-IN"/>
+              </w:rPr>
+              <w:t>ரு</w:t>
+            </w:r>
+            <w:r>
+              <w:rPr>
+                <w:rFonts w:ascii="Latha" w:hAnsi="Latha" w:cs="Latha"/>
+                <w:sz w:val="28"/>
+                <w:szCs w:val="28"/>
+                <w:cs/>
+                <w:lang w:bidi="ta-IN"/>
+              </w:rPr>
+              <w:t>த</w:t>
+            </w:r>
+            <w:r>
+              <w:rPr>
+                <w:rFonts w:ascii="BRH Tamil Tab Extra" w:hAnsi="BRH Tamil Tab Extra" w:cs="Latha"/>
+                <w:b/>
+                <w:sz w:val="32"/>
+                <w:szCs w:val="28"/>
+                <w:lang w:val="it-IT" w:bidi="ta-IN"/>
+              </w:rPr>
+              <w:t>……</w:t>
+            </w:r>
+            <w:r>
+              <w:rPr>
+                <w:rFonts w:ascii="Latha" w:hAnsi="Latha" w:cs="Latha"/>
+                <w:sz w:val="28"/>
+                <w:szCs w:val="28"/>
+                <w:cs/>
+                <w:lang w:bidi="ta-IN"/>
+              </w:rPr>
+              <w:t>ஶ்சக்ஷு</w:t>
+            </w:r>
+            <w:r>
+              <w:rPr>
+                <w:rFonts w:ascii="BRH Tamil Tab Extra" w:hAnsi="BRH Tamil Tab Extra" w:cs="Latha"/>
+                <w:b/>
+                <w:sz w:val="36"/>
+                <w:szCs w:val="28"/>
+                <w:lang w:val="it-IT" w:bidi="ta-IN"/>
+              </w:rPr>
+              <w:t>†</w:t>
+            </w:r>
+            <w:r>
+              <w:rPr>
+                <w:rFonts w:ascii="Latha" w:hAnsi="Latha" w:cs="Latha"/>
+                <w:sz w:val="28"/>
+                <w:szCs w:val="28"/>
+                <w:cs/>
+                <w:lang w:bidi="ta-IN"/>
+              </w:rPr>
+              <w:t>ஷ்மதீ</w:t>
+            </w:r>
+            <w:r>
+              <w:rPr>
+                <w:rFonts w:ascii="Latha" w:hAnsi="Latha" w:cs="Latha"/>
+                <w:b/>
+                <w:bCs/>
+                <w:sz w:val="32"/>
+                <w:szCs w:val="32"/>
+                <w:cs/>
+                <w:lang w:bidi="ta-IN"/>
+              </w:rPr>
+              <w:t>:</w:t>
+            </w:r>
+            <w:r>
+              <w:rPr>
+                <w:rFonts w:ascii="Latha" w:hAnsi="Latha" w:cs="Latha"/>
+                <w:sz w:val="28"/>
+                <w:szCs w:val="28"/>
+                <w:lang w:val="it-IT" w:bidi="ta-IN"/>
+              </w:rPr>
+              <w:t xml:space="preserve"> |</w:t>
+            </w:r>
+          </w:p>
+        </w:tc>
+      </w:tr>
+      <w:tr>
+        <w:trPr>
+          <w:trHeight w:val="918"/>
+        </w:trPr>
+        <w:tc>
+          <w:tcPr>
+            <w:tcW w:w="3877" w:type="dxa"/>
+          </w:tcPr>
+          <w:p>
+            <w:pPr>
+              <w:widowControl w:val="0"/>
+              <w:tabs>
+                <w:tab w:val="left" w:pos="993"/>
+              </w:tabs>
+              <w:autoSpaceDE w:val="0"/>
+              <w:autoSpaceDN w:val="0"/>
+              <w:adjustRightInd w:val="0"/>
+              <w:spacing w:before="0" w:line="252" w:lineRule="auto"/>
+              <w:ind w:right="297"/>
+              <w:rPr>
+                <w:rFonts w:cs="Arial"/>
+                <w:b/>
+                <w:sz w:val="28"/>
+                <w:szCs w:val="32"/>
+              </w:rPr>
+            </w:pPr>
+            <w:r>
+              <w:rPr>
+                <w:rFonts w:cs="Arial"/>
+                <w:b/>
+                <w:sz w:val="28"/>
+                <w:szCs w:val="32"/>
+              </w:rPr>
+              <w:t>T.S.5.7.</w:t>
+            </w:r>
+            <w:r>
+              <w:rPr>
+                <w:rFonts w:cs="Arial"/>
+                <w:b/>
+                <w:sz w:val="28"/>
+                <w:szCs w:val="32"/>
+              </w:rPr>
+              <w:t>10.</w:t>
+            </w:r>
+            <w:r>
+              <w:rPr>
+                <w:rFonts w:cs="Arial"/>
+                <w:b/>
+                <w:sz w:val="28"/>
+                <w:szCs w:val="32"/>
+              </w:rPr>
+              <w:t>3</w:t>
+            </w:r>
+            <w:r>
+              <w:rPr>
+                <w:rFonts w:cs="Arial"/>
+                <w:b/>
+                <w:sz w:val="28"/>
+                <w:szCs w:val="32"/>
+              </w:rPr>
+              <w:t xml:space="preserve"> – Kramam</w:t>
+            </w:r>
+          </w:p>
+          <w:p>
+            <w:pPr>
+              <w:widowControl w:val="0"/>
+              <w:tabs>
+                <w:tab w:val="left" w:pos="993"/>
+              </w:tabs>
+              <w:autoSpaceDE w:val="0"/>
+              <w:autoSpaceDN w:val="0"/>
+              <w:adjustRightInd w:val="0"/>
+              <w:spacing w:before="0" w:line="252" w:lineRule="auto"/>
+              <w:ind w:right="297"/>
+              <w:rPr>
+                <w:rFonts w:cs="Arial"/>
+                <w:b/>
+                <w:sz w:val="28"/>
+                <w:szCs w:val="32"/>
+                <w:lang w:val="en-IN"/>
+              </w:rPr>
+            </w:pPr>
+            <w:r>
+              <w:rPr>
+                <w:rFonts w:cs="Arial"/>
+                <w:b/>
+                <w:sz w:val="28"/>
+                <w:szCs w:val="32"/>
+                <w:lang w:val="en-IN"/>
+              </w:rPr>
+              <w:t>Krama Vaakyam No.</w:t>
+            </w:r>
+            <w:r>
+              <w:rPr>
+                <w:rFonts w:cs="Arial"/>
+                <w:b/>
+                <w:sz w:val="28"/>
+                <w:szCs w:val="32"/>
+                <w:lang w:val="en-IN"/>
+              </w:rPr>
+              <w:t>- 19</w:t>
+            </w:r>
+          </w:p>
+          <w:p>
+            <w:pPr>
+              <w:widowControl w:val="0"/>
+              <w:tabs>
+                <w:tab w:val="left" w:pos="993"/>
+              </w:tabs>
+              <w:autoSpaceDE w:val="0"/>
+              <w:autoSpaceDN w:val="0"/>
+              <w:adjustRightInd w:val="0"/>
+              <w:spacing w:before="0" w:line="252" w:lineRule="auto"/>
+              <w:ind w:right="297"/>
+              <w:rPr>
+                <w:rFonts w:cs="Arial"/>
+                <w:b/>
+                <w:sz w:val="28"/>
+                <w:szCs w:val="32"/>
+                <w:lang w:val="it-IT"/>
+              </w:rPr>
+            </w:pPr>
+            <w:r>
+              <w:rPr>
+                <w:rFonts w:cs="Arial"/>
+                <w:b/>
+                <w:sz w:val="28"/>
+                <w:szCs w:val="32"/>
+                <w:lang w:val="it-IT"/>
+              </w:rPr>
+              <w:t>Panchaati No</w:t>
+            </w:r>
+            <w:r>
+              <w:rPr>
+                <w:rFonts w:cs="Arial"/>
+                <w:b/>
+                <w:szCs w:val="32"/>
+                <w:lang w:val="it-IT"/>
+              </w:rPr>
+              <w:t xml:space="preserve">. - </w:t>
+            </w:r>
+            <w:r>
+              <w:rPr>
+                <w:rFonts w:cs="Arial"/>
+                <w:b/>
+                <w:sz w:val="28"/>
+                <w:szCs w:val="32"/>
+                <w:lang w:val="it-IT"/>
+              </w:rPr>
+              <w:t>4</w:t>
+            </w:r>
+            <w:r>
+              <w:rPr>
+                <w:rFonts w:cs="Arial"/>
+                <w:b/>
+                <w:sz w:val="28"/>
+                <w:szCs w:val="32"/>
+                <w:lang w:val="it-IT"/>
+              </w:rPr>
+              <w:t>2</w:t>
+            </w:r>
+          </w:p>
+        </w:tc>
+        <w:tc>
+          <w:tcPr>
+            <w:tcW w:w="4678" w:type="dxa"/>
           </w:tcPr>
           <w:p>
             <w:pPr>
@@ -1780,10 +1917,1079 @@
                 <w:lang w:bidi="ta-IN"/>
               </w:rPr>
             </w:pPr>
+            <w:r>
+              <w:rPr>
+                <w:rFonts w:ascii="Latha" w:hAnsi="Latha" w:cs="Latha"/>
+                <w:sz w:val="28"/>
+                <w:szCs w:val="28"/>
+                <w:cs/>
+                <w:lang w:bidi="ta-IN"/>
+              </w:rPr>
+              <w:t>அ</w:t>
+            </w:r>
+            <w:r>
+              <w:rPr>
+                <w:rFonts w:ascii="BRH Tamil Tab Extra" w:hAnsi="BRH Tamil Tab Extra" w:cs="Latha"/>
+                <w:b/>
+                <w:sz w:val="32"/>
+                <w:szCs w:val="28"/>
+                <w:lang w:bidi="ta-IN"/>
+              </w:rPr>
+              <w:t>……</w:t>
+            </w:r>
+            <w:r>
+              <w:rPr>
+                <w:rFonts w:ascii="Latha" w:hAnsi="Latha" w:cs="Latha"/>
+                <w:sz w:val="28"/>
+                <w:szCs w:val="28"/>
+                <w:cs/>
+                <w:lang w:bidi="ta-IN"/>
+              </w:rPr>
+              <w:t>ஸ்யா</w:t>
+            </w:r>
+            <w:r>
+              <w:rPr>
+                <w:rFonts w:ascii="Latha" w:hAnsi="Latha" w:cs="Latha"/>
+                <w:sz w:val="28"/>
+                <w:szCs w:val="28"/>
+                <w:highlight w:val="yellow"/>
+                <w:cs/>
+                <w:lang w:bidi="ta-IN"/>
+              </w:rPr>
+              <w:t>ன</w:t>
+            </w:r>
+            <w:r>
+              <w:rPr>
+                <w:rFonts w:ascii="BRH Tamil Tab Extra" w:hAnsi="BRH Tamil Tab Extra" w:cs="Latha"/>
+                <w:b/>
+                <w:sz w:val="36"/>
+                <w:szCs w:val="28"/>
+                <w:highlight w:val="yellow"/>
+                <w:lang w:bidi="ta-IN"/>
+              </w:rPr>
+              <w:t>‡</w:t>
+            </w:r>
+            <w:r>
+              <w:rPr>
+                <w:rFonts w:ascii="Latha" w:hAnsi="Latha" w:cs="Latha"/>
+                <w:sz w:val="28"/>
+                <w:szCs w:val="28"/>
+                <w:highlight w:val="yellow"/>
+                <w:cs/>
+                <w:lang w:bidi="ta-IN"/>
+              </w:rPr>
+              <w:t>ம்</w:t>
+            </w:r>
+            <w:r>
+              <w:rPr>
+                <w:rFonts w:ascii="Latha" w:hAnsi="Latha" w:cs="Latha"/>
+                <w:sz w:val="28"/>
+                <w:szCs w:val="28"/>
+                <w:lang w:bidi="ta-IN"/>
+              </w:rPr>
+              <w:t xml:space="preserve"> | </w:t>
+            </w:r>
+            <w:r>
+              <w:rPr>
+                <w:rFonts w:ascii="Latha" w:hAnsi="Latha" w:cs="Latha"/>
+                <w:sz w:val="28"/>
+                <w:szCs w:val="28"/>
+                <w:lang w:bidi="ta-IN"/>
+              </w:rPr>
+              <w:br/>
+            </w:r>
+            <w:r>
+              <w:rPr>
+                <w:rFonts w:ascii="Latha" w:hAnsi="Latha" w:cs="Latha"/>
+                <w:sz w:val="28"/>
+                <w:szCs w:val="28"/>
+                <w:cs/>
+                <w:lang w:bidi="ta-IN"/>
+              </w:rPr>
+              <w:t>அன்ன</w:t>
+            </w:r>
+            <w:r>
+              <w:rPr>
+                <w:rFonts w:ascii="BRH Devanagari Extra" w:hAnsi="BRH Devanagari Extra" w:cs="Latha"/>
+                <w:b/>
+                <w:sz w:val="36"/>
+                <w:szCs w:val="28"/>
+                <w:lang w:bidi="ta-IN"/>
+              </w:rPr>
+              <w:t>ò</w:t>
+            </w:r>
+            <w:r>
+              <w:rPr>
+                <w:rFonts w:ascii="BRH Tamil Tab Extra" w:hAnsi="BRH Tamil Tab Extra" w:cs="Latha"/>
+                <w:b/>
+                <w:sz w:val="36"/>
+                <w:szCs w:val="28"/>
+                <w:lang w:bidi="ta-IN"/>
+              </w:rPr>
+              <w:t>‡</w:t>
+            </w:r>
+            <w:r>
+              <w:rPr>
+                <w:rFonts w:ascii="Latha" w:hAnsi="Latha" w:cs="Latha"/>
+                <w:sz w:val="28"/>
+                <w:szCs w:val="28"/>
+                <w:lang w:bidi="ta-IN"/>
+              </w:rPr>
+              <w:t xml:space="preserve"> </w:t>
+            </w:r>
+            <w:r>
+              <w:rPr>
+                <w:rFonts w:ascii="Latha" w:hAnsi="Latha" w:cs="Latha"/>
+                <w:sz w:val="28"/>
+                <w:szCs w:val="28"/>
+                <w:cs/>
+                <w:lang w:bidi="ta-IN"/>
+              </w:rPr>
+              <w:t>ஸ்யாத்</w:t>
+            </w:r>
+            <w:r>
+              <w:rPr>
+                <w:rFonts w:ascii="Latha" w:hAnsi="Latha" w:cs="Latha"/>
+                <w:sz w:val="28"/>
+                <w:szCs w:val="28"/>
+                <w:lang w:bidi="ta-IN"/>
+              </w:rPr>
+              <w:t xml:space="preserve"> |</w:t>
+            </w:r>
+          </w:p>
+        </w:tc>
+        <w:tc>
+          <w:tcPr>
+            <w:tcW w:w="5280" w:type="dxa"/>
+          </w:tcPr>
+          <w:p>
+            <w:pPr>
+              <w:widowControl w:val="0"/>
+              <w:autoSpaceDE w:val="0"/>
+              <w:autoSpaceDN w:val="0"/>
+              <w:adjustRightInd w:val="0"/>
+              <w:spacing w:before="0" w:line="240" w:lineRule="auto"/>
+              <w:rPr>
+                <w:rFonts w:ascii="Latha" w:hAnsi="Latha" w:cs="Latha"/>
+                <w:sz w:val="28"/>
+                <w:szCs w:val="28"/>
+                <w:cs/>
+                <w:lang w:bidi="ta-IN"/>
+              </w:rPr>
+            </w:pPr>
+            <w:r>
+              <w:rPr>
+                <w:rFonts w:ascii="Latha" w:hAnsi="Latha" w:cs="Latha"/>
+                <w:sz w:val="28"/>
+                <w:szCs w:val="28"/>
+                <w:cs/>
+                <w:lang w:bidi="ta-IN"/>
+              </w:rPr>
+              <w:t>அ</w:t>
+            </w:r>
+            <w:r>
+              <w:rPr>
+                <w:rFonts w:ascii="BRH Tamil Tab Extra" w:hAnsi="BRH Tamil Tab Extra" w:cs="Latha"/>
+                <w:b/>
+                <w:sz w:val="32"/>
+                <w:szCs w:val="28"/>
+                <w:lang w:bidi="ta-IN"/>
+              </w:rPr>
+              <w:t>……</w:t>
+            </w:r>
+            <w:r>
+              <w:rPr>
+                <w:rFonts w:ascii="Latha" w:hAnsi="Latha" w:cs="Latha"/>
+                <w:sz w:val="28"/>
+                <w:szCs w:val="28"/>
+                <w:cs/>
+                <w:lang w:bidi="ta-IN"/>
+              </w:rPr>
+              <w:t>ஸ்யா</w:t>
+            </w:r>
+            <w:r>
+              <w:rPr>
+                <w:rFonts w:ascii="Latha" w:hAnsi="Latha" w:cs="Latha"/>
+                <w:sz w:val="28"/>
+                <w:szCs w:val="28"/>
+                <w:highlight w:val="green"/>
+                <w:cs/>
+                <w:lang w:bidi="ta-IN"/>
+              </w:rPr>
+              <w:t>ன்</w:t>
+            </w:r>
+            <w:r>
+              <w:rPr>
+                <w:rFonts w:ascii="Latha" w:hAnsi="Latha" w:cs="Latha"/>
+                <w:sz w:val="28"/>
+                <w:szCs w:val="28"/>
+                <w:highlight w:val="yellow"/>
+                <w:cs/>
+                <w:lang w:bidi="ta-IN"/>
+              </w:rPr>
+              <w:t>ன</w:t>
+            </w:r>
+            <w:r>
+              <w:rPr>
+                <w:rFonts w:ascii="BRH Tamil Tab Extra" w:hAnsi="BRH Tamil Tab Extra" w:cs="Latha"/>
+                <w:b/>
+                <w:sz w:val="36"/>
+                <w:szCs w:val="28"/>
+                <w:highlight w:val="yellow"/>
+                <w:lang w:bidi="ta-IN"/>
+              </w:rPr>
+              <w:t>‡</w:t>
+            </w:r>
+            <w:r>
+              <w:rPr>
+                <w:rFonts w:ascii="Latha" w:hAnsi="Latha" w:cs="Latha"/>
+                <w:sz w:val="28"/>
+                <w:szCs w:val="28"/>
+                <w:highlight w:val="yellow"/>
+                <w:cs/>
+                <w:lang w:bidi="ta-IN"/>
+              </w:rPr>
+              <w:t>ம்</w:t>
+            </w:r>
+            <w:r>
+              <w:rPr>
+                <w:rFonts w:ascii="Latha" w:hAnsi="Latha" w:cs="Latha"/>
+                <w:sz w:val="28"/>
+                <w:szCs w:val="28"/>
+                <w:lang w:bidi="ta-IN"/>
+              </w:rPr>
+              <w:t xml:space="preserve"> | </w:t>
+            </w:r>
+            <w:r>
+              <w:rPr>
+                <w:rFonts w:ascii="Latha" w:hAnsi="Latha" w:cs="Latha"/>
+                <w:sz w:val="28"/>
+                <w:szCs w:val="28"/>
+                <w:lang w:bidi="ta-IN"/>
+              </w:rPr>
+              <w:br/>
+            </w:r>
+            <w:r>
+              <w:rPr>
+                <w:rFonts w:ascii="Latha" w:hAnsi="Latha" w:cs="Latha"/>
+                <w:sz w:val="28"/>
+                <w:szCs w:val="28"/>
+                <w:cs/>
+                <w:lang w:bidi="ta-IN"/>
+              </w:rPr>
+              <w:t>அன்ன</w:t>
+            </w:r>
+            <w:r>
+              <w:rPr>
+                <w:rFonts w:ascii="BRH Devanagari Extra" w:hAnsi="BRH Devanagari Extra" w:cs="Latha"/>
+                <w:b/>
+                <w:sz w:val="36"/>
+                <w:szCs w:val="28"/>
+                <w:lang w:bidi="ta-IN"/>
+              </w:rPr>
+              <w:t>ò</w:t>
+            </w:r>
+            <w:r>
+              <w:rPr>
+                <w:rFonts w:ascii="BRH Tamil Tab Extra" w:hAnsi="BRH Tamil Tab Extra" w:cs="Latha"/>
+                <w:b/>
+                <w:sz w:val="36"/>
+                <w:szCs w:val="28"/>
+                <w:lang w:bidi="ta-IN"/>
+              </w:rPr>
+              <w:t>‡</w:t>
+            </w:r>
+            <w:r>
+              <w:rPr>
+                <w:rFonts w:ascii="Latha" w:hAnsi="Latha" w:cs="Latha"/>
+                <w:sz w:val="28"/>
+                <w:szCs w:val="28"/>
+                <w:lang w:bidi="ta-IN"/>
+              </w:rPr>
+              <w:t xml:space="preserve"> </w:t>
+            </w:r>
+            <w:r>
+              <w:rPr>
+                <w:rFonts w:ascii="Latha" w:hAnsi="Latha" w:cs="Latha"/>
+                <w:sz w:val="28"/>
+                <w:szCs w:val="28"/>
+                <w:cs/>
+                <w:lang w:bidi="ta-IN"/>
+              </w:rPr>
+              <w:t>ஸ்யாத்</w:t>
+            </w:r>
+            <w:r>
+              <w:rPr>
+                <w:rFonts w:ascii="Latha" w:hAnsi="Latha" w:cs="Latha"/>
+                <w:sz w:val="28"/>
+                <w:szCs w:val="28"/>
+                <w:lang w:bidi="ta-IN"/>
+              </w:rPr>
+              <w:t xml:space="preserve"> |</w:t>
+            </w:r>
+          </w:p>
+        </w:tc>
+      </w:tr>
+      <w:tr>
+        <w:trPr>
+          <w:trHeight w:val="918"/>
+        </w:trPr>
+        <w:tc>
+          <w:tcPr>
+            <w:tcW w:w="3877" w:type="dxa"/>
+          </w:tcPr>
+          <w:p>
+            <w:pPr>
+              <w:widowControl w:val="0"/>
+              <w:tabs>
+                <w:tab w:val="left" w:pos="993"/>
+              </w:tabs>
+              <w:autoSpaceDE w:val="0"/>
+              <w:autoSpaceDN w:val="0"/>
+              <w:adjustRightInd w:val="0"/>
+              <w:spacing w:before="0" w:line="252" w:lineRule="auto"/>
+              <w:ind w:right="297"/>
+              <w:rPr>
+                <w:rFonts w:cs="Arial"/>
+                <w:b/>
+                <w:sz w:val="28"/>
+                <w:szCs w:val="32"/>
+              </w:rPr>
+            </w:pPr>
+            <w:r>
+              <w:rPr>
+                <w:rFonts w:cs="Arial"/>
+                <w:b/>
+                <w:sz w:val="28"/>
+                <w:szCs w:val="32"/>
+              </w:rPr>
+              <w:t>T.S.5.7.</w:t>
+            </w:r>
+            <w:r>
+              <w:rPr>
+                <w:rFonts w:cs="Arial"/>
+                <w:b/>
+                <w:sz w:val="28"/>
+                <w:szCs w:val="32"/>
+              </w:rPr>
+              <w:t>1</w:t>
+            </w:r>
+            <w:r>
+              <w:rPr>
+                <w:rFonts w:cs="Arial"/>
+                <w:b/>
+                <w:sz w:val="28"/>
+                <w:szCs w:val="32"/>
+              </w:rPr>
+              <w:t>2</w:t>
+            </w:r>
+            <w:r>
+              <w:rPr>
+                <w:rFonts w:cs="Arial"/>
+                <w:b/>
+                <w:sz w:val="28"/>
+                <w:szCs w:val="32"/>
+              </w:rPr>
+              <w:t>.</w:t>
+            </w:r>
+            <w:r>
+              <w:rPr>
+                <w:rFonts w:cs="Arial"/>
+                <w:b/>
+                <w:sz w:val="28"/>
+                <w:szCs w:val="32"/>
+              </w:rPr>
+              <w:t>1</w:t>
+            </w:r>
+            <w:r>
+              <w:rPr>
+                <w:rFonts w:cs="Arial"/>
+                <w:b/>
+                <w:sz w:val="28"/>
+                <w:szCs w:val="32"/>
+              </w:rPr>
+              <w:t xml:space="preserve"> – Kramam</w:t>
+            </w:r>
+          </w:p>
+          <w:p>
+            <w:pPr>
+              <w:widowControl w:val="0"/>
+              <w:tabs>
+                <w:tab w:val="left" w:pos="993"/>
+              </w:tabs>
+              <w:autoSpaceDE w:val="0"/>
+              <w:autoSpaceDN w:val="0"/>
+              <w:adjustRightInd w:val="0"/>
+              <w:spacing w:before="0" w:line="252" w:lineRule="auto"/>
+              <w:ind w:right="297"/>
+              <w:rPr>
+                <w:rFonts w:cs="Arial"/>
+                <w:b/>
+                <w:sz w:val="28"/>
+                <w:szCs w:val="32"/>
+                <w:lang w:val="en-IN"/>
+              </w:rPr>
+            </w:pPr>
+            <w:r>
+              <w:rPr>
+                <w:rFonts w:cs="Arial"/>
+                <w:b/>
+                <w:sz w:val="28"/>
+                <w:szCs w:val="32"/>
+                <w:lang w:val="en-IN"/>
+              </w:rPr>
+              <w:t>Krama Vaakyam No.</w:t>
+            </w:r>
+            <w:r>
+              <w:rPr>
+                <w:rFonts w:cs="Arial"/>
+                <w:b/>
+                <w:sz w:val="28"/>
+                <w:szCs w:val="32"/>
+                <w:lang w:val="en-IN"/>
+              </w:rPr>
+              <w:t xml:space="preserve">- </w:t>
+            </w:r>
+            <w:r>
+              <w:rPr>
+                <w:rFonts w:cs="Arial"/>
+                <w:b/>
+                <w:sz w:val="28"/>
+                <w:szCs w:val="32"/>
+                <w:lang w:val="en-IN"/>
+              </w:rPr>
+              <w:t>6</w:t>
+            </w:r>
+          </w:p>
+          <w:p>
+            <w:pPr>
+              <w:widowControl w:val="0"/>
+              <w:tabs>
+                <w:tab w:val="left" w:pos="993"/>
+              </w:tabs>
+              <w:autoSpaceDE w:val="0"/>
+              <w:autoSpaceDN w:val="0"/>
+              <w:adjustRightInd w:val="0"/>
+              <w:spacing w:before="0" w:line="252" w:lineRule="auto"/>
+              <w:ind w:right="297"/>
+              <w:rPr>
+                <w:rFonts w:cs="Arial"/>
+                <w:b/>
+                <w:sz w:val="28"/>
+                <w:szCs w:val="32"/>
+              </w:rPr>
+            </w:pPr>
+            <w:r>
+              <w:rPr>
+                <w:rFonts w:cs="Arial"/>
+                <w:b/>
+                <w:sz w:val="28"/>
+                <w:szCs w:val="32"/>
+                <w:lang w:val="it-IT"/>
+              </w:rPr>
+              <w:t>Panchaati No</w:t>
+            </w:r>
+            <w:r>
+              <w:rPr>
+                <w:rFonts w:cs="Arial"/>
+                <w:b/>
+                <w:szCs w:val="32"/>
+                <w:lang w:val="it-IT"/>
+              </w:rPr>
+              <w:t xml:space="preserve">. - </w:t>
+            </w:r>
+            <w:r>
+              <w:rPr>
+                <w:rFonts w:cs="Arial"/>
+                <w:b/>
+                <w:sz w:val="28"/>
+                <w:szCs w:val="32"/>
+                <w:lang w:val="it-IT"/>
+              </w:rPr>
+              <w:t>4</w:t>
+            </w:r>
+            <w:r>
+              <w:rPr>
+                <w:rFonts w:cs="Arial"/>
+                <w:b/>
+                <w:sz w:val="28"/>
+                <w:szCs w:val="32"/>
+                <w:lang w:val="it-IT"/>
+              </w:rPr>
+              <w:t>4</w:t>
+            </w:r>
+          </w:p>
+        </w:tc>
+        <w:tc>
+          <w:tcPr>
+            <w:tcW w:w="4678" w:type="dxa"/>
+          </w:tcPr>
+          <w:p>
+            <w:pPr>
+              <w:widowControl w:val="0"/>
+              <w:autoSpaceDE w:val="0"/>
+              <w:autoSpaceDN w:val="0"/>
+              <w:adjustRightInd w:val="0"/>
+              <w:spacing w:before="0" w:line="240" w:lineRule="auto"/>
+              <w:rPr>
+                <w:rFonts w:ascii="Latha" w:hAnsi="Latha" w:cs="Latha"/>
+                <w:sz w:val="28"/>
+                <w:szCs w:val="28"/>
+                <w:cs/>
+                <w:lang w:bidi="ta-IN"/>
+              </w:rPr>
+            </w:pPr>
+            <w:r>
+              <w:rPr>
+                <w:rFonts w:ascii="Latha" w:hAnsi="Latha" w:cs="Latha"/>
+                <w:sz w:val="28"/>
+                <w:szCs w:val="28"/>
+                <w:cs/>
+                <w:lang w:bidi="ta-IN"/>
+              </w:rPr>
+              <w:t>ஆ</w:t>
+            </w:r>
+            <w:r>
+              <w:rPr>
+                <w:rFonts w:ascii="BRH Tamil Tab Extra" w:hAnsi="BRH Tamil Tab Extra" w:cs="Latha"/>
+                <w:b/>
+                <w:sz w:val="32"/>
+                <w:szCs w:val="28"/>
+                <w:lang w:bidi="ta-IN"/>
+              </w:rPr>
+              <w:t>……</w:t>
+            </w:r>
+            <w:r>
+              <w:rPr>
+                <w:rFonts w:ascii="Latha" w:hAnsi="Latha" w:cs="Latha"/>
+                <w:sz w:val="28"/>
+                <w:szCs w:val="28"/>
+                <w:cs/>
+                <w:lang w:bidi="ta-IN"/>
+              </w:rPr>
+              <w:t>தி</w:t>
+            </w:r>
+            <w:r>
+              <w:rPr>
+                <w:rFonts w:ascii="BRH Tamil Tab Extra" w:hAnsi="BRH Tamil Tab Extra" w:cs="Latha"/>
+                <w:b/>
+                <w:sz w:val="32"/>
+                <w:szCs w:val="28"/>
+                <w:lang w:bidi="ta-IN"/>
+              </w:rPr>
+              <w:t>……</w:t>
+            </w:r>
+            <w:r>
+              <w:rPr>
+                <w:rFonts w:ascii="Latha" w:hAnsi="Latha" w:cs="Latha"/>
+                <w:b/>
+                <w:bCs/>
+                <w:position w:val="-12"/>
+                <w:sz w:val="28"/>
+                <w:szCs w:val="28"/>
+                <w:cs/>
+                <w:lang w:bidi="ta-IN"/>
+              </w:rPr>
+              <w:t>3</w:t>
+            </w:r>
+            <w:r>
+              <w:rPr>
+                <w:rFonts w:ascii="Latha" w:hAnsi="Latha" w:cs="Latha"/>
+                <w:sz w:val="28"/>
+                <w:szCs w:val="28"/>
+                <w:cs/>
+                <w:lang w:bidi="ta-IN"/>
+              </w:rPr>
+              <w:t>த்யா</w:t>
+            </w:r>
+            <w:r>
+              <w:rPr>
+                <w:rFonts w:ascii="Latha" w:hAnsi="Latha" w:cs="Latha"/>
+                <w:color w:val="EE0000"/>
+                <w:sz w:val="28"/>
+                <w:szCs w:val="28"/>
+                <w:highlight w:val="yellow"/>
+                <w:cs/>
+                <w:lang w:bidi="ta-IN"/>
+              </w:rPr>
+              <w:t>ன்</w:t>
+            </w:r>
+            <w:r>
+              <w:rPr>
+                <w:rFonts w:ascii="Latha" w:hAnsi="Latha" w:cs="Latha"/>
+                <w:color w:val="EE0000"/>
+                <w:sz w:val="28"/>
+                <w:szCs w:val="28"/>
+                <w:highlight w:val="yellow"/>
+                <w:lang w:bidi="ta-IN"/>
+              </w:rPr>
+              <w:t xml:space="preserve"> </w:t>
+            </w:r>
+            <w:r>
+              <w:rPr>
+                <w:rFonts w:ascii="Latha" w:hAnsi="Latha" w:cs="Latha"/>
+                <w:color w:val="EE0000"/>
+                <w:sz w:val="28"/>
+                <w:szCs w:val="28"/>
+                <w:highlight w:val="yellow"/>
+                <w:cs/>
+                <w:lang w:bidi="ta-IN"/>
+              </w:rPr>
+              <w:t>ஶ்</w:t>
+            </w:r>
+            <w:r>
+              <w:rPr>
+                <w:rFonts w:ascii="Latha" w:hAnsi="Latha" w:cs="Latha"/>
+                <w:sz w:val="28"/>
+                <w:szCs w:val="28"/>
+                <w:cs/>
+                <w:lang w:bidi="ta-IN"/>
+              </w:rPr>
+              <w:t>ம</w:t>
+            </w:r>
+            <w:r>
+              <w:rPr>
+                <w:rFonts w:ascii="Latha" w:hAnsi="Latha" w:cs="Latha"/>
+                <w:sz w:val="28"/>
+                <w:szCs w:val="28"/>
+                <w:cs/>
+                <w:lang w:bidi="ta-IN"/>
+              </w:rPr>
+              <w:t>ஶ்ரு</w:t>
+            </w:r>
+            <w:r>
+              <w:rPr>
+                <w:rFonts w:ascii="BRH Tamil Tab Extra" w:hAnsi="BRH Tamil Tab Extra" w:cs="Latha"/>
+                <w:b/>
+                <w:sz w:val="36"/>
+                <w:szCs w:val="28"/>
+                <w:lang w:bidi="ta-IN"/>
+              </w:rPr>
+              <w:t>†</w:t>
+            </w:r>
+            <w:r>
+              <w:rPr>
+                <w:rFonts w:ascii="Latha" w:hAnsi="Latha" w:cs="Latha"/>
+                <w:sz w:val="28"/>
+                <w:szCs w:val="28"/>
+                <w:cs/>
+                <w:lang w:bidi="ta-IN"/>
+              </w:rPr>
+              <w:t>பி</w:t>
+            </w:r>
+            <w:r>
+              <w:rPr>
+                <w:rFonts w:ascii="Latha" w:hAnsi="Latha" w:cs="Latha"/>
+                <w:b/>
+                <w:bCs/>
+                <w:position w:val="-12"/>
+                <w:sz w:val="28"/>
+                <w:szCs w:val="28"/>
+                <w:cs/>
+                <w:lang w:bidi="ta-IN"/>
+              </w:rPr>
+              <w:t>4</w:t>
+            </w:r>
+            <w:r>
+              <w:rPr>
+                <w:rFonts w:ascii="Latha" w:hAnsi="Latha" w:cs="Latha"/>
+                <w:b/>
+                <w:bCs/>
+                <w:sz w:val="32"/>
+                <w:szCs w:val="32"/>
+                <w:cs/>
+                <w:lang w:bidi="ta-IN"/>
+              </w:rPr>
+              <w:t>:</w:t>
+            </w:r>
+            <w:r>
+              <w:rPr>
+                <w:rFonts w:ascii="Latha" w:hAnsi="Latha" w:cs="Latha"/>
+                <w:sz w:val="28"/>
+                <w:szCs w:val="28"/>
+                <w:lang w:bidi="ta-IN"/>
+              </w:rPr>
+              <w:t xml:space="preserve"> | </w:t>
+            </w:r>
+            <w:r>
+              <w:rPr>
+                <w:rFonts w:ascii="Latha" w:hAnsi="Latha" w:cs="Latha"/>
+                <w:sz w:val="28"/>
+                <w:szCs w:val="28"/>
+                <w:cs/>
+                <w:lang w:bidi="ta-IN"/>
+              </w:rPr>
+              <w:t>ஶ்மஶ்ரு</w:t>
+            </w:r>
+            <w:r>
+              <w:rPr>
+                <w:rFonts w:ascii="BRH Tamil Tab Extra" w:hAnsi="BRH Tamil Tab Extra" w:cs="Latha"/>
+                <w:b/>
+                <w:sz w:val="36"/>
+                <w:szCs w:val="28"/>
+                <w:lang w:bidi="ta-IN"/>
+              </w:rPr>
+              <w:t>†</w:t>
+            </w:r>
+            <w:r>
+              <w:rPr>
+                <w:rFonts w:ascii="Latha" w:hAnsi="Latha" w:cs="Latha"/>
+                <w:sz w:val="28"/>
+                <w:szCs w:val="28"/>
+                <w:cs/>
+                <w:lang w:bidi="ta-IN"/>
+              </w:rPr>
+              <w:t>பி</w:t>
+            </w:r>
+            <w:r>
+              <w:rPr>
+                <w:rFonts w:ascii="Latha" w:hAnsi="Latha" w:cs="Latha"/>
+                <w:b/>
+                <w:bCs/>
+                <w:position w:val="-12"/>
+                <w:sz w:val="28"/>
+                <w:szCs w:val="28"/>
+                <w:cs/>
+                <w:lang w:bidi="ta-IN"/>
+              </w:rPr>
+              <w:t>4</w:t>
+            </w:r>
+            <w:r>
+              <w:rPr>
+                <w:rFonts w:ascii="Latha" w:hAnsi="Latha" w:cs="Latha"/>
+                <w:sz w:val="28"/>
+                <w:szCs w:val="28"/>
+                <w:cs/>
+                <w:lang w:bidi="ta-IN"/>
+              </w:rPr>
+              <w:t>ருபயா</w:t>
+            </w:r>
+            <w:r>
+              <w:rPr>
+                <w:rFonts w:ascii="BRH Tamil Tab Extra" w:hAnsi="BRH Tamil Tab Extra" w:cs="Latha"/>
+                <w:b/>
+                <w:sz w:val="32"/>
+                <w:szCs w:val="28"/>
+                <w:lang w:bidi="ta-IN"/>
+              </w:rPr>
+              <w:t>……</w:t>
+            </w:r>
+            <w:r>
+              <w:rPr>
+                <w:rFonts w:ascii="Latha" w:hAnsi="Latha" w:cs="Latha"/>
+                <w:sz w:val="28"/>
+                <w:szCs w:val="28"/>
+                <w:cs/>
+                <w:lang w:bidi="ta-IN"/>
+              </w:rPr>
+              <w:t>மம்</w:t>
+            </w:r>
+            <w:r>
+              <w:rPr>
+                <w:rFonts w:ascii="Latha" w:hAnsi="Latha" w:cs="Latha"/>
+                <w:sz w:val="28"/>
+                <w:szCs w:val="28"/>
+                <w:lang w:bidi="ta-IN"/>
+              </w:rPr>
+              <w:t xml:space="preserve"> |</w:t>
+            </w:r>
+          </w:p>
+        </w:tc>
+        <w:tc>
+          <w:tcPr>
+            <w:tcW w:w="5280" w:type="dxa"/>
+          </w:tcPr>
+          <w:p>
+            <w:pPr>
+              <w:widowControl w:val="0"/>
+              <w:autoSpaceDE w:val="0"/>
+              <w:autoSpaceDN w:val="0"/>
+              <w:adjustRightInd w:val="0"/>
+              <w:spacing w:before="0" w:line="240" w:lineRule="auto"/>
+              <w:rPr>
+                <w:rFonts w:ascii="Latha" w:hAnsi="Latha" w:cs="Latha"/>
+                <w:sz w:val="28"/>
+                <w:szCs w:val="28"/>
+                <w:cs/>
+                <w:lang w:bidi="ta-IN"/>
+              </w:rPr>
+            </w:pPr>
+            <w:r>
+              <w:rPr>
+                <w:rFonts w:ascii="Latha" w:hAnsi="Latha" w:cs="Latha"/>
+                <w:sz w:val="28"/>
+                <w:szCs w:val="28"/>
+                <w:cs/>
+                <w:lang w:bidi="ta-IN"/>
+              </w:rPr>
+              <w:t>ஆ</w:t>
+            </w:r>
+            <w:r>
+              <w:rPr>
+                <w:rFonts w:ascii="BRH Tamil Tab Extra" w:hAnsi="BRH Tamil Tab Extra" w:cs="Latha"/>
+                <w:b/>
+                <w:sz w:val="32"/>
+                <w:szCs w:val="28"/>
+                <w:lang w:bidi="ta-IN"/>
+              </w:rPr>
+              <w:t>……</w:t>
+            </w:r>
+            <w:r>
+              <w:rPr>
+                <w:rFonts w:ascii="Latha" w:hAnsi="Latha" w:cs="Latha"/>
+                <w:sz w:val="28"/>
+                <w:szCs w:val="28"/>
+                <w:cs/>
+                <w:lang w:bidi="ta-IN"/>
+              </w:rPr>
+              <w:t>தி</w:t>
+            </w:r>
+            <w:r>
+              <w:rPr>
+                <w:rFonts w:ascii="BRH Tamil Tab Extra" w:hAnsi="BRH Tamil Tab Extra" w:cs="Latha"/>
+                <w:b/>
+                <w:sz w:val="32"/>
+                <w:szCs w:val="28"/>
+                <w:lang w:bidi="ta-IN"/>
+              </w:rPr>
+              <w:t>……</w:t>
+            </w:r>
+            <w:r>
+              <w:rPr>
+                <w:rFonts w:ascii="Latha" w:hAnsi="Latha" w:cs="Latha"/>
+                <w:b/>
+                <w:bCs/>
+                <w:position w:val="-12"/>
+                <w:sz w:val="28"/>
+                <w:szCs w:val="28"/>
+                <w:cs/>
+                <w:lang w:bidi="ta-IN"/>
+              </w:rPr>
+              <w:t>3</w:t>
+            </w:r>
+            <w:r>
+              <w:rPr>
+                <w:rFonts w:ascii="Latha" w:hAnsi="Latha" w:cs="Latha"/>
+                <w:sz w:val="28"/>
+                <w:szCs w:val="28"/>
+                <w:cs/>
+                <w:lang w:bidi="ta-IN"/>
+              </w:rPr>
+              <w:t>த்யா</w:t>
+            </w:r>
+            <w:r>
+              <w:rPr>
+                <w:rFonts w:ascii="Latha" w:hAnsi="Latha" w:cs="Latha"/>
+                <w:sz w:val="28"/>
+                <w:szCs w:val="28"/>
+                <w:highlight w:val="green"/>
+                <w:cs/>
+                <w:lang w:bidi="ta-IN"/>
+                <w14:ligatures w14:val="standardContextual"/>
+              </w:rPr>
+              <w:t>ஞ் ச்</w:t>
+            </w:r>
+            <w:r>
+              <w:rPr>
+                <w:rFonts w:ascii="Latha" w:hAnsi="Latha" w:cs="Latha"/>
+                <w:b/>
+                <w:bCs/>
+                <w:position w:val="-12"/>
+                <w:sz w:val="28"/>
+                <w:szCs w:val="28"/>
+                <w:highlight w:val="green"/>
+                <w:cs/>
+                <w:lang w:bidi="ta-IN"/>
+                <w14:ligatures w14:val="standardContextual"/>
+              </w:rPr>
+              <w:t>2</w:t>
+            </w:r>
+            <w:r>
+              <w:rPr>
+                <w:rFonts w:ascii="Latha" w:hAnsi="Latha" w:cs="Latha"/>
+                <w:sz w:val="28"/>
+                <w:szCs w:val="28"/>
+                <w:cs/>
+                <w:lang w:bidi="ta-IN"/>
+              </w:rPr>
+              <w:t>ம</w:t>
+            </w:r>
+            <w:r>
+              <w:rPr>
+                <w:rFonts w:ascii="Latha" w:hAnsi="Latha" w:cs="Latha"/>
+                <w:sz w:val="28"/>
+                <w:szCs w:val="28"/>
+                <w:cs/>
+                <w:lang w:bidi="ta-IN"/>
+              </w:rPr>
+              <w:t>ஶ்ரு</w:t>
+            </w:r>
+            <w:r>
+              <w:rPr>
+                <w:rFonts w:ascii="BRH Tamil Tab Extra" w:hAnsi="BRH Tamil Tab Extra" w:cs="Latha"/>
+                <w:b/>
+                <w:sz w:val="36"/>
+                <w:szCs w:val="28"/>
+                <w:lang w:bidi="ta-IN"/>
+              </w:rPr>
+              <w:t>†</w:t>
+            </w:r>
+            <w:r>
+              <w:rPr>
+                <w:rFonts w:ascii="Latha" w:hAnsi="Latha" w:cs="Latha"/>
+                <w:sz w:val="28"/>
+                <w:szCs w:val="28"/>
+                <w:cs/>
+                <w:lang w:bidi="ta-IN"/>
+              </w:rPr>
+              <w:t>பி</w:t>
+            </w:r>
+            <w:r>
+              <w:rPr>
+                <w:rFonts w:ascii="Latha" w:hAnsi="Latha" w:cs="Latha"/>
+                <w:b/>
+                <w:bCs/>
+                <w:position w:val="-12"/>
+                <w:sz w:val="28"/>
+                <w:szCs w:val="28"/>
+                <w:cs/>
+                <w:lang w:bidi="ta-IN"/>
+              </w:rPr>
+              <w:t>4</w:t>
+            </w:r>
+            <w:r>
+              <w:rPr>
+                <w:rFonts w:ascii="Latha" w:hAnsi="Latha" w:cs="Latha"/>
+                <w:b/>
+                <w:bCs/>
+                <w:sz w:val="32"/>
+                <w:szCs w:val="32"/>
+                <w:cs/>
+                <w:lang w:bidi="ta-IN"/>
+              </w:rPr>
+              <w:t>:</w:t>
+            </w:r>
+            <w:r>
+              <w:rPr>
+                <w:rFonts w:ascii="Latha" w:hAnsi="Latha" w:cs="Latha"/>
+                <w:sz w:val="28"/>
+                <w:szCs w:val="28"/>
+                <w:lang w:bidi="ta-IN"/>
+              </w:rPr>
+              <w:t xml:space="preserve"> | </w:t>
+            </w:r>
+            <w:r>
+              <w:rPr>
+                <w:rFonts w:ascii="Latha" w:hAnsi="Latha" w:cs="Latha"/>
+                <w:sz w:val="28"/>
+                <w:szCs w:val="28"/>
+                <w:cs/>
+                <w:lang w:bidi="ta-IN"/>
+              </w:rPr>
+              <w:t>ஶ்மஶ்ரு</w:t>
+            </w:r>
+            <w:r>
+              <w:rPr>
+                <w:rFonts w:ascii="BRH Tamil Tab Extra" w:hAnsi="BRH Tamil Tab Extra" w:cs="Latha"/>
+                <w:b/>
+                <w:sz w:val="36"/>
+                <w:szCs w:val="28"/>
+                <w:lang w:bidi="ta-IN"/>
+              </w:rPr>
+              <w:t>†</w:t>
+            </w:r>
+            <w:r>
+              <w:rPr>
+                <w:rFonts w:ascii="Latha" w:hAnsi="Latha" w:cs="Latha"/>
+                <w:sz w:val="28"/>
+                <w:szCs w:val="28"/>
+                <w:cs/>
+                <w:lang w:bidi="ta-IN"/>
+              </w:rPr>
+              <w:t>பி</w:t>
+            </w:r>
+            <w:r>
+              <w:rPr>
+                <w:rFonts w:ascii="Latha" w:hAnsi="Latha" w:cs="Latha"/>
+                <w:b/>
+                <w:bCs/>
+                <w:position w:val="-12"/>
+                <w:sz w:val="28"/>
+                <w:szCs w:val="28"/>
+                <w:cs/>
+                <w:lang w:bidi="ta-IN"/>
+              </w:rPr>
+              <w:t>4</w:t>
+            </w:r>
+            <w:r>
+              <w:rPr>
+                <w:rFonts w:ascii="Latha" w:hAnsi="Latha" w:cs="Latha"/>
+                <w:sz w:val="28"/>
+                <w:szCs w:val="28"/>
+                <w:cs/>
+                <w:lang w:bidi="ta-IN"/>
+              </w:rPr>
+              <w:t>ருபயா</w:t>
+            </w:r>
+            <w:r>
+              <w:rPr>
+                <w:rFonts w:ascii="BRH Tamil Tab Extra" w:hAnsi="BRH Tamil Tab Extra" w:cs="Latha"/>
+                <w:b/>
+                <w:sz w:val="32"/>
+                <w:szCs w:val="28"/>
+                <w:lang w:bidi="ta-IN"/>
+              </w:rPr>
+              <w:t>……</w:t>
+            </w:r>
+            <w:r>
+              <w:rPr>
+                <w:rFonts w:ascii="Latha" w:hAnsi="Latha" w:cs="Latha"/>
+                <w:sz w:val="28"/>
+                <w:szCs w:val="28"/>
+                <w:cs/>
+                <w:lang w:bidi="ta-IN"/>
+              </w:rPr>
+              <w:t>மம்</w:t>
+            </w:r>
+            <w:r>
+              <w:rPr>
+                <w:rFonts w:ascii="Latha" w:hAnsi="Latha" w:cs="Latha"/>
+                <w:sz w:val="28"/>
+                <w:szCs w:val="28"/>
+                <w:lang w:bidi="ta-IN"/>
+              </w:rPr>
+              <w:t xml:space="preserve"> |</w:t>
+            </w:r>
           </w:p>
         </w:tc>
       </w:tr>
     </w:tbl>
+    <w:p>
+      <w:pPr>
+        <w:jc w:val="center"/>
+        <w:rPr>
+          <w:b/>
+          <w:bCs/>
+          <w:sz w:val="32"/>
+          <w:szCs w:val="32"/>
+          <w:u w:val="single"/>
+          <w:lang w:val="it-IT"/>
+        </w:rPr>
+      </w:pPr>
+    </w:p>
+    <w:p>
+      <w:pPr>
+        <w:jc w:val="center"/>
+        <w:rPr>
+          <w:b/>
+          <w:bCs/>
+          <w:sz w:val="32"/>
+          <w:szCs w:val="32"/>
+          <w:u w:val="single"/>
+          <w:lang w:val="it-IT"/>
+        </w:rPr>
+      </w:pPr>
+    </w:p>
     <w:p>
       <w:pPr>
         <w:jc w:val="center"/>
@@ -2015,7 +3221,6 @@
                 <w:sz w:val="32"/>
                 <w:szCs w:val="32"/>
               </w:rPr>
-              <w:lastRenderedPageBreak/>
               <w:t>Reference</w:t>
             </w:r>
           </w:p>
@@ -2042,7 +3247,6 @@
                 <w:sz w:val="32"/>
                 <w:szCs w:val="32"/>
               </w:rPr>
-              <w:lastRenderedPageBreak/>
               <w:t>As Printed</w:t>
             </w:r>
           </w:p>
@@ -4161,7 +5365,6 @@
                 <w:sz w:val="28"/>
                 <w:szCs w:val="32"/>
               </w:rPr>
-              <w:lastRenderedPageBreak/>
               <w:t>T.S.5.7.1.2 – Kramam</w:t>
             </w:r>
           </w:p>
@@ -6972,6 +8175,7 @@
                 <w:sz w:val="28"/>
                 <w:szCs w:val="32"/>
               </w:rPr>
+              <w:lastRenderedPageBreak/>
               <w:t>T.S.5.7.4.2 – Kramam</w:t>
             </w:r>
           </w:p>
@@ -8269,7 +9473,6 @@
                 <w:sz w:val="28"/>
                 <w:szCs w:val="32"/>
               </w:rPr>
-              <w:lastRenderedPageBreak/>
               <w:t>T.S.5.7.4.4 – Kramam</w:t>
             </w:r>
           </w:p>
@@ -11059,6 +12262,7 @@
                 <w:sz w:val="28"/>
                 <w:szCs w:val="32"/>
               </w:rPr>
+              <w:lastRenderedPageBreak/>
               <w:t>T.S.5.7.6.3 – Kramam</w:t>
             </w:r>
           </w:p>
@@ -12025,7 +13229,6 @@
                 <w:sz w:val="28"/>
                 <w:szCs w:val="32"/>
               </w:rPr>
-              <w:lastRenderedPageBreak/>
               <w:t>T.S.5.7.6.6 – Kramam</w:t>
             </w:r>
           </w:p>
@@ -14888,6 +16091,7 @@
                 <w:sz w:val="28"/>
                 <w:szCs w:val="32"/>
               </w:rPr>
+              <w:lastRenderedPageBreak/>
               <w:t>T.S.5.7.9.4 – Kramam</w:t>
             </w:r>
           </w:p>
@@ -15859,7 +17063,6 @@
                 <w:sz w:val="28"/>
                 <w:szCs w:val="32"/>
               </w:rPr>
-              <w:lastRenderedPageBreak/>
               <w:t>T.S.5.7.12.1 – Kramam</w:t>
             </w:r>
           </w:p>
@@ -17839,6 +19042,7 @@
           <w:szCs w:val="32"/>
           <w:u w:val="single"/>
         </w:rPr>
+        <w:lastRenderedPageBreak/>
         <w:t xml:space="preserve">TS </w:t>
       </w:r>
       <w:r>
@@ -18221,7 +19425,6 @@
                 <w:szCs w:val="40"/>
                 <w:lang w:bidi="ml-IN"/>
               </w:rPr>
-              <w:lastRenderedPageBreak/>
               <w:t>xÉ SþÍ¤É</w:t>
             </w:r>
             <w:r>
@@ -18323,7 +19526,6 @@
                 <w:szCs w:val="40"/>
                 <w:lang w:bidi="ml-IN"/>
               </w:rPr>
-              <w:lastRenderedPageBreak/>
               <w:t>AÉ</w:t>
             </w:r>
             <w:r>
@@ -18375,7 +19577,6 @@
                 <w:szCs w:val="40"/>
                 <w:lang w:bidi="ml-IN"/>
               </w:rPr>
-              <w:lastRenderedPageBreak/>
               <w:t>xÉ SþÍ¤É</w:t>
             </w:r>
             <w:r>
@@ -18483,7 +19684,6 @@
                 <w:szCs w:val="40"/>
                 <w:lang w:bidi="ml-IN"/>
               </w:rPr>
-              <w:lastRenderedPageBreak/>
               <w:t>AÉ</w:t>
             </w:r>
             <w:r>
@@ -18603,7 +19803,6 @@
           <w:b/>
           <w:sz w:val="32"/>
         </w:rPr>
-        <w:lastRenderedPageBreak/>
         <w:t>=============</w:t>
       </w:r>
     </w:p>
@@ -19929,7 +21128,7 @@
   <w:style w:type="paragraph" w:default="1" w:styleId="Normal">
     <w:name w:val="Normal"/>
     <w:qFormat/>
-    <w:rsid w:val="00076C05"/>
+    <w:rsid w:val="004F35EB"/>
     <w:pPr>
       <w:spacing w:before="120" w:line="276" w:lineRule="auto"/>
     </w:pPr>

</xml_diff>